<commit_message>
Avancement jusqu'a requete 5
</commit_message>
<xml_diff>
--- a/TP3 - InfluxDB & Grafana/CETINKAYA_FADHLOUNE.docx
+++ b/TP3 - InfluxDB & Grafana/CETINKAYA_FADHLOUNE.docx
@@ -547,10 +547,12 @@
           <w:pPr>
             <w:pStyle w:val="Titre1"/>
           </w:pPr>
+          <w:bookmarkStart w:id="2" w:name="_Toc219278374"/>
           <w:r>
             <w:lastRenderedPageBreak/>
             <w:t>Sommaire</w:t>
           </w:r>
+          <w:bookmarkEnd w:id="2"/>
         </w:p>
         <w:p>
           <w:pPr>
@@ -625,7 +627,77 @@
             </w:rPr>
             <w:fldChar w:fldCharType="separate"/>
           </w:r>
-          <w:hyperlink w:anchor="_Toc219271399" w:history="1">
+          <w:hyperlink w:anchor="_Toc219278374" w:history="1">
+            <w:r>
+              <w:rPr>
+                <w:rStyle w:val="Lienhypertexte"/>
+                <w:noProof/>
+              </w:rPr>
+              <w:t>Sommaire</w:t>
+            </w:r>
+            <w:r>
+              <w:rPr>
+                <w:noProof/>
+                <w:webHidden/>
+              </w:rPr>
+              <w:tab/>
+            </w:r>
+            <w:r>
+              <w:rPr>
+                <w:noProof/>
+                <w:webHidden/>
+              </w:rPr>
+              <w:fldChar w:fldCharType="begin"/>
+            </w:r>
+            <w:r>
+              <w:rPr>
+                <w:noProof/>
+                <w:webHidden/>
+              </w:rPr>
+              <w:instrText xml:space="preserve"> PAGEREF _Toc219278374 \h </w:instrText>
+            </w:r>
+            <w:r>
+              <w:rPr>
+                <w:noProof/>
+                <w:webHidden/>
+              </w:rPr>
+            </w:r>
+            <w:r>
+              <w:rPr>
+                <w:noProof/>
+                <w:webHidden/>
+              </w:rPr>
+              <w:fldChar w:fldCharType="separate"/>
+            </w:r>
+            <w:r>
+              <w:rPr>
+                <w:noProof/>
+                <w:webHidden/>
+              </w:rPr>
+              <w:t>2</w:t>
+            </w:r>
+            <w:r>
+              <w:rPr>
+                <w:noProof/>
+                <w:webHidden/>
+              </w:rPr>
+              <w:fldChar w:fldCharType="end"/>
+            </w:r>
+          </w:hyperlink>
+        </w:p>
+        <w:p>
+          <w:pPr>
+            <w:pStyle w:val="TM1"/>
+            <w:tabs>
+              <w:tab w:val="right" w:leader="dot" w:pos="9062"/>
+            </w:tabs>
+            <w:rPr>
+              <w:rFonts w:eastAsiaTheme="minorEastAsia"/>
+              <w:noProof/>
+              <w:lang w:eastAsia="fr-FR"/>
+            </w:rPr>
+          </w:pPr>
+          <w:hyperlink w:anchor="_Toc219278375" w:history="1">
             <w:r>
               <w:rPr>
                 <w:rStyle w:val="Lienhypertexte"/>
@@ -652,7 +724,7 @@
                 <w:noProof/>
                 <w:webHidden/>
               </w:rPr>
-              <w:instrText xml:space="preserve"> PAGEREF _Toc219271399 \h </w:instrText>
+              <w:instrText xml:space="preserve"> PAGEREF _Toc219278375 \h </w:instrText>
             </w:r>
             <w:r>
               <w:rPr>
@@ -696,7 +768,7 @@
               <w:lang w:eastAsia="fr-FR"/>
             </w:rPr>
           </w:pPr>
-          <w:hyperlink w:anchor="_Toc219271400" w:history="1">
+          <w:hyperlink w:anchor="_Toc219278376" w:history="1">
             <w:r>
               <w:rPr>
                 <w:rStyle w:val="Lienhypertexte"/>
@@ -738,7 +810,7 @@
                 <w:noProof/>
                 <w:webHidden/>
               </w:rPr>
-              <w:instrText xml:space="preserve"> PAGEREF _Toc219271400 \h </w:instrText>
+              <w:instrText xml:space="preserve"> PAGEREF _Toc219278376 \h </w:instrText>
             </w:r>
             <w:r>
               <w:rPr>
@@ -782,7 +854,7 @@
               <w:lang w:eastAsia="fr-FR"/>
             </w:rPr>
           </w:pPr>
-          <w:hyperlink w:anchor="_Toc219271401" w:history="1">
+          <w:hyperlink w:anchor="_Toc219278377" w:history="1">
             <w:r>
               <w:rPr>
                 <w:rStyle w:val="Lienhypertexte"/>
@@ -824,7 +896,7 @@
                 <w:noProof/>
                 <w:webHidden/>
               </w:rPr>
-              <w:instrText xml:space="preserve"> PAGEREF _Toc219271401 \h </w:instrText>
+              <w:instrText xml:space="preserve"> PAGEREF _Toc219278377 \h </w:instrText>
             </w:r>
             <w:r>
               <w:rPr>
@@ -868,7 +940,7 @@
               <w:lang w:eastAsia="fr-FR"/>
             </w:rPr>
           </w:pPr>
-          <w:hyperlink w:anchor="_Toc219271402" w:history="1">
+          <w:hyperlink w:anchor="_Toc219278378" w:history="1">
             <w:r>
               <w:rPr>
                 <w:rStyle w:val="Lienhypertexte"/>
@@ -910,7 +982,7 @@
                 <w:noProof/>
                 <w:webHidden/>
               </w:rPr>
-              <w:instrText xml:space="preserve"> PAGEREF _Toc219271402 \h </w:instrText>
+              <w:instrText xml:space="preserve"> PAGEREF _Toc219278378 \h </w:instrText>
             </w:r>
             <w:r>
               <w:rPr>
@@ -954,7 +1026,7 @@
               <w:lang w:eastAsia="fr-FR"/>
             </w:rPr>
           </w:pPr>
-          <w:hyperlink w:anchor="_Toc219271403" w:history="1">
+          <w:hyperlink w:anchor="_Toc219278379" w:history="1">
             <w:r>
               <w:rPr>
                 <w:rStyle w:val="Lienhypertexte"/>
@@ -996,7 +1068,7 @@
                 <w:noProof/>
                 <w:webHidden/>
               </w:rPr>
-              <w:instrText xml:space="preserve"> PAGEREF _Toc219271403 \h </w:instrText>
+              <w:instrText xml:space="preserve"> PAGEREF _Toc219278379 \h </w:instrText>
             </w:r>
             <w:r>
               <w:rPr>
@@ -1040,7 +1112,7 @@
               <w:lang w:eastAsia="fr-FR"/>
             </w:rPr>
           </w:pPr>
-          <w:hyperlink w:anchor="_Toc219271404" w:history="1">
+          <w:hyperlink w:anchor="_Toc219278380" w:history="1">
             <w:r>
               <w:rPr>
                 <w:rStyle w:val="Lienhypertexte"/>
@@ -1082,7 +1154,7 @@
                 <w:noProof/>
                 <w:webHidden/>
               </w:rPr>
-              <w:instrText xml:space="preserve"> PAGEREF _Toc219271404 \h </w:instrText>
+              <w:instrText xml:space="preserve"> PAGEREF _Toc219278380 \h </w:instrText>
             </w:r>
             <w:r>
               <w:rPr>
@@ -1125,7 +1197,7 @@
               <w:lang w:eastAsia="fr-FR"/>
             </w:rPr>
           </w:pPr>
-          <w:hyperlink w:anchor="_Toc219271405" w:history="1">
+          <w:hyperlink w:anchor="_Toc219278381" w:history="1">
             <w:r>
               <w:rPr>
                 <w:rStyle w:val="Lienhypertexte"/>
@@ -1152,7 +1224,7 @@
                 <w:noProof/>
                 <w:webHidden/>
               </w:rPr>
-              <w:instrText xml:space="preserve"> PAGEREF _Toc219271405 \h </w:instrText>
+              <w:instrText xml:space="preserve"> PAGEREF _Toc219278381 \h </w:instrText>
             </w:r>
             <w:r>
               <w:rPr>
@@ -1196,7 +1268,7 @@
               <w:lang w:eastAsia="fr-FR"/>
             </w:rPr>
           </w:pPr>
-          <w:hyperlink w:anchor="_Toc219271406" w:history="1">
+          <w:hyperlink w:anchor="_Toc219278382" w:history="1">
             <w:r>
               <w:rPr>
                 <w:rStyle w:val="Lienhypertexte"/>
@@ -1238,7 +1310,7 @@
                 <w:noProof/>
                 <w:webHidden/>
               </w:rPr>
-              <w:instrText xml:space="preserve"> PAGEREF _Toc219271406 \h </w:instrText>
+              <w:instrText xml:space="preserve"> PAGEREF _Toc219278382 \h </w:instrText>
             </w:r>
             <w:r>
               <w:rPr>
@@ -1282,7 +1354,7 @@
               <w:lang w:eastAsia="fr-FR"/>
             </w:rPr>
           </w:pPr>
-          <w:hyperlink w:anchor="_Toc219271407" w:history="1">
+          <w:hyperlink w:anchor="_Toc219278383" w:history="1">
             <w:r>
               <w:rPr>
                 <w:rStyle w:val="Lienhypertexte"/>
@@ -1324,7 +1396,7 @@
                 <w:noProof/>
                 <w:webHidden/>
               </w:rPr>
-              <w:instrText xml:space="preserve"> PAGEREF _Toc219271407 \h </w:instrText>
+              <w:instrText xml:space="preserve"> PAGEREF _Toc219278383 \h </w:instrText>
             </w:r>
             <w:r>
               <w:rPr>
@@ -1368,7 +1440,7 @@
               <w:lang w:eastAsia="fr-FR"/>
             </w:rPr>
           </w:pPr>
-          <w:hyperlink w:anchor="_Toc219271408" w:history="1">
+          <w:hyperlink w:anchor="_Toc219278384" w:history="1">
             <w:r>
               <w:rPr>
                 <w:rStyle w:val="Lienhypertexte"/>
@@ -1410,7 +1482,7 @@
                 <w:noProof/>
                 <w:webHidden/>
               </w:rPr>
-              <w:instrText xml:space="preserve"> PAGEREF _Toc219271408 \h </w:instrText>
+              <w:instrText xml:space="preserve"> PAGEREF _Toc219278384 \h </w:instrText>
             </w:r>
             <w:r>
               <w:rPr>
@@ -1443,8 +1515,9 @@
         </w:p>
         <w:p>
           <w:pPr>
-            <w:pStyle w:val="TM4"/>
+            <w:pStyle w:val="TM3"/>
             <w:tabs>
+              <w:tab w:val="left" w:pos="960"/>
               <w:tab w:val="right" w:leader="dot" w:pos="9062"/>
             </w:tabs>
             <w:rPr>
@@ -1453,13 +1526,28 @@
               <w:lang w:eastAsia="fr-FR"/>
             </w:rPr>
           </w:pPr>
-          <w:hyperlink w:anchor="_Toc219271409" w:history="1">
+          <w:hyperlink w:anchor="_Toc219278385" w:history="1">
             <w:r>
               <w:rPr>
                 <w:rStyle w:val="Lienhypertexte"/>
                 <w:noProof/>
               </w:rPr>
-              <w:t>1.3 Requêtes adaptées aux différents types de visualisations</w:t>
+              <w:t>c.</w:t>
+            </w:r>
+            <w:r>
+              <w:rPr>
+                <w:rFonts w:eastAsiaTheme="minorEastAsia"/>
+                <w:noProof/>
+                <w:lang w:eastAsia="fr-FR"/>
+              </w:rPr>
+              <w:tab/>
+            </w:r>
+            <w:r>
+              <w:rPr>
+                <w:rStyle w:val="Lienhypertexte"/>
+                <w:noProof/>
+              </w:rPr>
+              <w:t>Requêtes adaptées aux différents types de visualisations</w:t>
             </w:r>
             <w:r>
               <w:rPr>
@@ -1480,7 +1568,7 @@
                 <w:noProof/>
                 <w:webHidden/>
               </w:rPr>
-              <w:instrText xml:space="preserve"> PAGEREF _Toc219271409 \h </w:instrText>
+              <w:instrText xml:space="preserve"> PAGEREF _Toc219278385 \h </w:instrText>
             </w:r>
             <w:r>
               <w:rPr>
@@ -1500,7 +1588,7 @@
                 <w:noProof/>
                 <w:webHidden/>
               </w:rPr>
-              <w:t>9</w:t>
+              <w:t>11</w:t>
             </w:r>
             <w:r>
               <w:rPr>
@@ -1524,13 +1612,13 @@
               <w:lang w:eastAsia="fr-FR"/>
             </w:rPr>
           </w:pPr>
-          <w:hyperlink w:anchor="_Toc219271410" w:history="1">
+          <w:hyperlink w:anchor="_Toc219278386" w:history="1">
             <w:r>
               <w:rPr>
                 <w:rStyle w:val="Lienhypertexte"/>
                 <w:noProof/>
               </w:rPr>
-              <w:t>c.</w:t>
+              <w:t>d.</w:t>
             </w:r>
             <w:r>
               <w:rPr>
@@ -1566,7 +1654,7 @@
                 <w:noProof/>
                 <w:webHidden/>
               </w:rPr>
-              <w:instrText xml:space="preserve"> PAGEREF _Toc219271410 \h </w:instrText>
+              <w:instrText xml:space="preserve"> PAGEREF _Toc219278386 \h </w:instrText>
             </w:r>
             <w:r>
               <w:rPr>
@@ -1586,7 +1674,7 @@
                 <w:noProof/>
                 <w:webHidden/>
               </w:rPr>
-              <w:t>10</w:t>
+              <w:t>12</w:t>
             </w:r>
             <w:r>
               <w:rPr>
@@ -1609,7 +1697,7 @@
               <w:lang w:eastAsia="fr-FR"/>
             </w:rPr>
           </w:pPr>
-          <w:hyperlink w:anchor="_Toc219271411" w:history="1">
+          <w:hyperlink w:anchor="_Toc219278387" w:history="1">
             <w:r>
               <w:rPr>
                 <w:rStyle w:val="Lienhypertexte"/>
@@ -1636,7 +1724,7 @@
                 <w:noProof/>
                 <w:webHidden/>
               </w:rPr>
-              <w:instrText xml:space="preserve"> PAGEREF _Toc219271411 \h </w:instrText>
+              <w:instrText xml:space="preserve"> PAGEREF _Toc219278387 \h </w:instrText>
             </w:r>
             <w:r>
               <w:rPr>
@@ -1656,7 +1744,7 @@
                 <w:noProof/>
                 <w:webHidden/>
               </w:rPr>
-              <w:t>11</w:t>
+              <w:t>13</w:t>
             </w:r>
             <w:r>
               <w:rPr>
@@ -1742,20 +1830,20 @@
           <w:pPr>
             <w:pStyle w:val="Titre1"/>
           </w:pPr>
-          <w:bookmarkStart w:id="2" w:name="_Toc219271399"/>
+          <w:bookmarkStart w:id="3" w:name="_Toc219278375"/>
           <w:r>
             <w:lastRenderedPageBreak/>
             <w:t>TRAVAIL A FAIRE N°1</w:t>
           </w:r>
-          <w:bookmarkEnd w:id="2"/>
+          <w:bookmarkEnd w:id="3"/>
         </w:p>
         <w:p>
           <w:pPr>
             <w:pStyle w:val="Titre2"/>
           </w:pPr>
-          <w:bookmarkStart w:id="3" w:name="_Toc218602572"/>
-          <w:bookmarkStart w:id="4" w:name="_Toc218602616"/>
-          <w:bookmarkStart w:id="5" w:name="_Toc219271400"/>
+          <w:bookmarkStart w:id="4" w:name="_Toc218602572"/>
+          <w:bookmarkStart w:id="5" w:name="_Toc218602616"/>
+          <w:bookmarkStart w:id="6" w:name="_Toc219278376"/>
           <w:r>
             <w:t>Concepts de base d'</w:t>
           </w:r>
@@ -1763,20 +1851,20 @@
           <w:r>
             <w:t>InfluxDB</w:t>
           </w:r>
-          <w:bookmarkEnd w:id="3"/>
           <w:bookmarkEnd w:id="4"/>
           <w:bookmarkEnd w:id="5"/>
+          <w:bookmarkEnd w:id="6"/>
           <w:proofErr w:type="spellEnd"/>
         </w:p>
         <w:p>
           <w:pPr>
             <w:pStyle w:val="Titre3"/>
           </w:pPr>
-          <w:bookmarkStart w:id="6" w:name="_Toc219271401"/>
+          <w:bookmarkStart w:id="7" w:name="_Toc219278377"/>
           <w:r>
             <w:t>Définition et contexte</w:t>
           </w:r>
-          <w:bookmarkEnd w:id="6"/>
+          <w:bookmarkEnd w:id="7"/>
         </w:p>
         <w:p>
           <w:pPr>
@@ -1814,11 +1902,11 @@
           <w:pPr>
             <w:pStyle w:val="Titre3"/>
           </w:pPr>
-          <w:bookmarkStart w:id="7" w:name="_Toc219271402"/>
+          <w:bookmarkStart w:id="8" w:name="_Toc219278378"/>
           <w:r>
             <w:t>Concepts fondamentaux</w:t>
           </w:r>
-          <w:bookmarkEnd w:id="7"/>
+          <w:bookmarkEnd w:id="8"/>
         </w:p>
         <w:p>
           <w:pPr>
@@ -2944,9 +3032,9 @@
           <w:pPr>
             <w:pStyle w:val="Titre2"/>
           </w:pPr>
-          <w:bookmarkStart w:id="8" w:name="_Toc218602573"/>
-          <w:bookmarkStart w:id="9" w:name="_Toc218602617"/>
-          <w:bookmarkStart w:id="10" w:name="_Toc219271403"/>
+          <w:bookmarkStart w:id="9" w:name="_Toc218602573"/>
+          <w:bookmarkStart w:id="10" w:name="_Toc218602617"/>
+          <w:bookmarkStart w:id="11" w:name="_Toc219278379"/>
           <w:r>
             <w:lastRenderedPageBreak/>
             <w:t xml:space="preserve">Guidelines concernant le design d'une base </w:t>
@@ -2955,9 +3043,9 @@
           <w:r>
             <w:t>InfluxDB</w:t>
           </w:r>
-          <w:bookmarkEnd w:id="8"/>
           <w:bookmarkEnd w:id="9"/>
           <w:bookmarkEnd w:id="10"/>
+          <w:bookmarkEnd w:id="11"/>
           <w:proofErr w:type="spellEnd"/>
         </w:p>
         <w:p>
@@ -2968,11 +3056,11 @@
               <w:numId w:val="16"/>
             </w:numPr>
           </w:pPr>
-          <w:bookmarkStart w:id="11" w:name="_Toc219271404"/>
+          <w:bookmarkStart w:id="12" w:name="_Toc219278380"/>
           <w:r>
             <w:t>Principes fondamentaux de conception</w:t>
           </w:r>
-          <w:bookmarkEnd w:id="11"/>
+          <w:bookmarkEnd w:id="12"/>
         </w:p>
         <w:p>
           <w:pPr>
@@ -5197,8 +5285,8 @@
             </w:rPr>
             <w:t>Documenter exhaustivement le schéma de données</w:t>
           </w:r>
-          <w:bookmarkStart w:id="12" w:name="_Toc218602576"/>
-          <w:bookmarkStart w:id="13" w:name="_Toc218602620"/>
+          <w:bookmarkStart w:id="13" w:name="_Toc218602576"/>
+          <w:bookmarkStart w:id="14" w:name="_Toc218602620"/>
         </w:p>
         <w:p>
           <w:pPr>
@@ -5224,12 +5312,12 @@
           <w:pPr>
             <w:pStyle w:val="Titre1"/>
           </w:pPr>
-          <w:bookmarkStart w:id="14" w:name="_Toc219271405"/>
+          <w:bookmarkStart w:id="15" w:name="_Toc219278381"/>
           <w:r>
             <w:lastRenderedPageBreak/>
             <w:t>TRAVAIL A FAIRE N°2</w:t>
           </w:r>
-          <w:bookmarkEnd w:id="14"/>
+          <w:bookmarkEnd w:id="15"/>
         </w:p>
         <w:p>
           <w:pPr>
@@ -5239,23 +5327,23 @@
               <w:numId w:val="26"/>
             </w:numPr>
           </w:pPr>
-          <w:bookmarkStart w:id="15" w:name="_Toc219271406"/>
+          <w:bookmarkStart w:id="16" w:name="_Toc219278382"/>
           <w:r>
             <w:t>Requêtes Flux et visualisation de données</w:t>
           </w:r>
-          <w:bookmarkEnd w:id="12"/>
           <w:bookmarkEnd w:id="13"/>
-          <w:bookmarkEnd w:id="15"/>
+          <w:bookmarkEnd w:id="14"/>
+          <w:bookmarkEnd w:id="16"/>
         </w:p>
         <w:p>
           <w:pPr>
             <w:pStyle w:val="Titre3"/>
           </w:pPr>
-          <w:bookmarkStart w:id="16" w:name="_Toc219271407"/>
+          <w:bookmarkStart w:id="17" w:name="_Toc219278383"/>
           <w:r>
             <w:t>Introduction au langage Flux</w:t>
           </w:r>
-          <w:bookmarkEnd w:id="16"/>
+          <w:bookmarkEnd w:id="17"/>
         </w:p>
         <w:p>
           <w:pPr>
@@ -5300,11 +5388,11 @@
           <w:pPr>
             <w:pStyle w:val="Titre3"/>
           </w:pPr>
-          <w:bookmarkStart w:id="17" w:name="_Toc219271408"/>
+          <w:bookmarkStart w:id="18" w:name="_Toc219278384"/>
           <w:r>
             <w:t>Exemples de requêtes Flux</w:t>
           </w:r>
-          <w:bookmarkEnd w:id="17"/>
+          <w:bookmarkEnd w:id="18"/>
         </w:p>
         <w:p>
           <w:pPr>
@@ -6374,109 +6462,559 @@
               <w:szCs w:val="20"/>
             </w:rPr>
             <w:lastRenderedPageBreak/>
-            <w:t>1.2.4 Calcul de moyenne sur une période</w:t>
-          </w:r>
-        </w:p>
-        <w:p>
-          <w:pPr>
-            <w:rPr>
-              <w:sz w:val="20"/>
-              <w:szCs w:val="20"/>
-            </w:rPr>
-          </w:pPr>
-          <w:r>
-            <w:rPr>
-              <w:sz w:val="20"/>
-              <w:szCs w:val="20"/>
-            </w:rPr>
-            <w:t>L'agrégation temporelle permet de réduire le volume de données et d'obtenir des statistiques sur des fenêtres temporelles.</w:t>
-          </w:r>
-        </w:p>
-        <w:p>
-          <w:pPr>
-            <w:rPr>
-              <w:sz w:val="20"/>
-              <w:szCs w:val="20"/>
-            </w:rPr>
-          </w:pPr>
-        </w:p>
-        <w:p>
-          <w:pPr>
+            <w:t xml:space="preserve">1.2.4 </w:t>
+          </w:r>
+          <w:r>
             <w:rPr>
               <w:b/>
               <w:bCs/>
               <w:sz w:val="20"/>
               <w:szCs w:val="20"/>
             </w:rPr>
-          </w:pPr>
-          <w:r>
+            <w:t>Répartition des Températures Critiques (&gt; 75)</w:t>
+          </w:r>
+        </w:p>
+        <w:p>
+          <w:pPr>
+            <w:rPr>
+              <w:sz w:val="20"/>
+              <w:szCs w:val="20"/>
+            </w:rPr>
+          </w:pPr>
+          <w:r>
+            <w:rPr>
+              <w:noProof/>
+              <w:sz w:val="20"/>
+              <w:szCs w:val="20"/>
+            </w:rPr>
+            <w:drawing>
+              <wp:inline distT="0" distB="0" distL="0" distR="0" wp14:anchorId="30BACB3C" wp14:editId="3759CE80">
+                <wp:extent cx="5760720" cy="1367790"/>
+                <wp:effectExtent l="0" t="0" r="5080" b="3810"/>
+                <wp:docPr id="446077130" name="Image 1"/>
+                <wp:cNvGraphicFramePr>
+                  <a:graphicFrameLocks xmlns:a="http://schemas.openxmlformats.org/drawingml/2006/main" noChangeAspect="1"/>
+                </wp:cNvGraphicFramePr>
+                <a:graphic xmlns:a="http://schemas.openxmlformats.org/drawingml/2006/main">
+                  <a:graphicData uri="http://schemas.openxmlformats.org/drawingml/2006/picture">
+                    <pic:pic xmlns:pic="http://schemas.openxmlformats.org/drawingml/2006/picture">
+                      <pic:nvPicPr>
+                        <pic:cNvPr id="446077130" name="Image 446077130"/>
+                        <pic:cNvPicPr/>
+                      </pic:nvPicPr>
+                      <pic:blipFill>
+                        <a:blip r:embed="rId12">
+                          <a:extLst>
+                            <a:ext uri="{28A0092B-C50C-407E-A947-70E740481C1C}">
+                              <a14:useLocalDpi xmlns:a14="http://schemas.microsoft.com/office/drawing/2010/main" val="0"/>
+                            </a:ext>
+                          </a:extLst>
+                        </a:blip>
+                        <a:stretch>
+                          <a:fillRect/>
+                        </a:stretch>
+                      </pic:blipFill>
+                      <pic:spPr>
+                        <a:xfrm>
+                          <a:off x="0" y="0"/>
+                          <a:ext cx="5760720" cy="1367790"/>
+                        </a:xfrm>
+                        <a:prstGeom prst="rect">
+                          <a:avLst/>
+                        </a:prstGeom>
+                      </pic:spPr>
+                    </pic:pic>
+                  </a:graphicData>
+                </a:graphic>
+              </wp:inline>
+            </w:drawing>
+          </w:r>
+        </w:p>
+        <w:p>
+          <w:pPr>
+            <w:rPr>
+              <w:sz w:val="20"/>
+              <w:szCs w:val="20"/>
+            </w:rPr>
+          </w:pPr>
+          <w:r>
+            <w:rPr>
+              <w:sz w:val="20"/>
+              <w:szCs w:val="20"/>
+            </w:rPr>
+            <w:t>Cette requête a pour fonction principale d'isoler les données critiques en appliquant un filtre de seuil strict aux relevés de température. Contrairement aux scripts précédents qui récupéraient l'intégralité des mesures, la ligne 5 (</w:t>
+          </w:r>
+          <w:proofErr w:type="spellStart"/>
+          <w:proofErr w:type="gramStart"/>
+          <w:r>
+            <w:rPr>
+              <w:sz w:val="20"/>
+              <w:szCs w:val="20"/>
+            </w:rPr>
+            <w:t>filter</w:t>
+          </w:r>
+          <w:proofErr w:type="spellEnd"/>
+          <w:r>
+            <w:rPr>
+              <w:sz w:val="20"/>
+              <w:szCs w:val="20"/>
+            </w:rPr>
+            <w:t>(</w:t>
+          </w:r>
+          <w:proofErr w:type="spellStart"/>
+          <w:r>
+            <w:rPr>
+              <w:sz w:val="20"/>
+              <w:szCs w:val="20"/>
+            </w:rPr>
+            <w:t>fn</w:t>
+          </w:r>
+          <w:proofErr w:type="spellEnd"/>
+          <w:r>
+            <w:rPr>
+              <w:sz w:val="20"/>
+              <w:szCs w:val="20"/>
+            </w:rPr>
+            <w:t>:</w:t>
+          </w:r>
+          <w:proofErr w:type="gramEnd"/>
+          <w:r>
+            <w:rPr>
+              <w:sz w:val="20"/>
+              <w:szCs w:val="20"/>
+            </w:rPr>
+            <w:t xml:space="preserve"> (r) =&gt; r["_value"] &gt; 75.0)) ordonne à la base de données d'ignorer tout ce qui est inférieur ou égal à 75 et de ne renvoyer que les valeurs "chaudes". Elle sert d'outil de surveillance ou d'alerte (monitoring) pour identifier instantanément les anomalies, te permettant de te concentrer uniquement sur les capteurs qui dépassent une limite de sécurité ou de confort définie, sans être pollué par le bruit des données normales.</w:t>
+          </w:r>
+        </w:p>
+        <w:p>
+          <w:pPr>
+            <w:rPr>
+              <w:sz w:val="20"/>
+              <w:szCs w:val="20"/>
+            </w:rPr>
+          </w:pPr>
+        </w:p>
+        <w:p>
+          <w:pPr>
+            <w:rPr>
+              <w:sz w:val="20"/>
+              <w:szCs w:val="20"/>
+            </w:rPr>
+          </w:pPr>
+          <w:r>
+            <w:rPr>
+              <w:noProof/>
+              <w:sz w:val="20"/>
+              <w:szCs w:val="20"/>
+            </w:rPr>
+            <w:drawing>
+              <wp:inline distT="0" distB="0" distL="0" distR="0" wp14:anchorId="7A94E912" wp14:editId="1CAB7B0C">
+                <wp:extent cx="5760720" cy="2409190"/>
+                <wp:effectExtent l="0" t="0" r="5080" b="3810"/>
+                <wp:docPr id="847174099" name="Image 2" descr="Une image contenant capture d’écran, Logiciel de graphisme, Logiciel multimédia, Modélisation 3D&#10;&#10;Le contenu généré par l’IA peut être incorrect."/>
+                <wp:cNvGraphicFramePr>
+                  <a:graphicFrameLocks xmlns:a="http://schemas.openxmlformats.org/drawingml/2006/main" noChangeAspect="1"/>
+                </wp:cNvGraphicFramePr>
+                <a:graphic xmlns:a="http://schemas.openxmlformats.org/drawingml/2006/main">
+                  <a:graphicData uri="http://schemas.openxmlformats.org/drawingml/2006/picture">
+                    <pic:pic xmlns:pic="http://schemas.openxmlformats.org/drawingml/2006/picture">
+                      <pic:nvPicPr>
+                        <pic:cNvPr id="847174099" name="Image 2" descr="Une image contenant capture d’écran, Logiciel de graphisme, Logiciel multimédia, Modélisation 3D&#10;&#10;Le contenu généré par l’IA peut être incorrect."/>
+                        <pic:cNvPicPr/>
+                      </pic:nvPicPr>
+                      <pic:blipFill>
+                        <a:blip r:embed="rId13" cstate="print">
+                          <a:extLst>
+                            <a:ext uri="{28A0092B-C50C-407E-A947-70E740481C1C}">
+                              <a14:useLocalDpi xmlns:a14="http://schemas.microsoft.com/office/drawing/2010/main" val="0"/>
+                            </a:ext>
+                          </a:extLst>
+                        </a:blip>
+                        <a:stretch>
+                          <a:fillRect/>
+                        </a:stretch>
+                      </pic:blipFill>
+                      <pic:spPr>
+                        <a:xfrm>
+                          <a:off x="0" y="0"/>
+                          <a:ext cx="5760720" cy="2409190"/>
+                        </a:xfrm>
+                        <a:prstGeom prst="rect">
+                          <a:avLst/>
+                        </a:prstGeom>
+                      </pic:spPr>
+                    </pic:pic>
+                  </a:graphicData>
+                </a:graphic>
+              </wp:inline>
+            </w:drawing>
+          </w:r>
+        </w:p>
+        <w:p>
+          <w:pPr>
+            <w:rPr>
+              <w:sz w:val="20"/>
+              <w:szCs w:val="20"/>
+            </w:rPr>
+          </w:pPr>
+          <w:r>
+            <w:rPr>
+              <w:sz w:val="20"/>
+              <w:szCs w:val="20"/>
+            </w:rPr>
+            <w:t>Le graphique résultant, intitulé "</w:t>
+          </w:r>
+          <w:proofErr w:type="spellStart"/>
+          <w:r>
+            <w:rPr>
+              <w:sz w:val="20"/>
+              <w:szCs w:val="20"/>
+            </w:rPr>
+            <w:t>Temperature</w:t>
+          </w:r>
+          <w:proofErr w:type="spellEnd"/>
+          <w:r>
+            <w:rPr>
+              <w:sz w:val="20"/>
+              <w:szCs w:val="20"/>
+            </w:rPr>
+            <w:t xml:space="preserve"> &gt; 75", est un histogramme qui sert à qualifier la sévérité de ce dépassement de seuil. Au lieu de montrer une évolution dans le temps, il affiche la fréquence d'apparition des températures uniquement dans cette zone critique (de 75,0 à environ 75,7). Il est utile pour l'analyse de risque car il te permet de voir comment se répartit la "surchauffe" : ici, on voit que la majorité des valeurs excessives se regroupent autour de 75,2 et 75,3 (les barres les plus hautes), ce qui indique que si le seuil est franchi, la température reste relativement contenue juste au-dessus de la limite et ne part pas vers des extrêmes incontrôlés.</w:t>
+          </w:r>
+        </w:p>
+        <w:p>
+          <w:pPr>
+            <w:rPr>
+              <w:sz w:val="20"/>
+              <w:szCs w:val="20"/>
+            </w:rPr>
+          </w:pPr>
+        </w:p>
+        <w:p>
+          <w:pPr>
+            <w:rPr>
+              <w:sz w:val="20"/>
+              <w:szCs w:val="20"/>
+            </w:rPr>
+          </w:pPr>
+        </w:p>
+        <w:p>
+          <w:pPr>
+            <w:rPr>
+              <w:sz w:val="20"/>
+              <w:szCs w:val="20"/>
+            </w:rPr>
+          </w:pPr>
+        </w:p>
+        <w:p>
+          <w:pPr>
+            <w:rPr>
+              <w:sz w:val="20"/>
+              <w:szCs w:val="20"/>
+            </w:rPr>
+          </w:pPr>
+        </w:p>
+        <w:p>
+          <w:pPr>
+            <w:rPr>
+              <w:sz w:val="20"/>
+              <w:szCs w:val="20"/>
+            </w:rPr>
+          </w:pPr>
+        </w:p>
+        <w:p>
+          <w:pPr>
+            <w:rPr>
+              <w:sz w:val="20"/>
+              <w:szCs w:val="20"/>
+            </w:rPr>
+          </w:pPr>
+        </w:p>
+        <w:p>
+          <w:pPr>
             <w:rPr>
               <w:b/>
               <w:bCs/>
               <w:sz w:val="20"/>
               <w:szCs w:val="20"/>
             </w:rPr>
-            <w:t>1.2.5 Calcul de valeurs extrêmes</w:t>
-          </w:r>
-        </w:p>
-        <w:p>
-          <w:pPr>
-            <w:rPr>
-              <w:sz w:val="20"/>
-              <w:szCs w:val="20"/>
-            </w:rPr>
-          </w:pPr>
-          <w:r>
-            <w:rPr>
-              <w:sz w:val="20"/>
-              <w:szCs w:val="20"/>
-            </w:rPr>
-            <w:t>Les fonctions d'agrégation permettent d'identifier les valeurs maximales et minimales.</w:t>
-          </w:r>
-        </w:p>
-        <w:p>
-          <w:pPr>
+          </w:pPr>
+          <w:r>
             <w:rPr>
               <w:b/>
               <w:bCs/>
               <w:sz w:val="20"/>
               <w:szCs w:val="20"/>
             </w:rPr>
-          </w:pPr>
-        </w:p>
-        <w:p>
-          <w:pPr>
+            <w:lastRenderedPageBreak/>
+            <w:t xml:space="preserve">1.2.5 </w:t>
+          </w:r>
+          <w:r>
             <w:rPr>
               <w:b/>
               <w:bCs/>
               <w:sz w:val="20"/>
               <w:szCs w:val="20"/>
             </w:rPr>
-          </w:pPr>
-          <w:r>
+            <w:t>Stabilité Temporelle des Zones Thermiques</w:t>
+          </w:r>
+        </w:p>
+        <w:p>
+          <w:pPr>
+            <w:rPr>
+              <w:sz w:val="20"/>
+              <w:szCs w:val="20"/>
+            </w:rPr>
+          </w:pPr>
+          <w:r>
+            <w:rPr>
+              <w:noProof/>
+              <w:sz w:val="20"/>
+              <w:szCs w:val="20"/>
+            </w:rPr>
+            <w:drawing>
+              <wp:inline distT="0" distB="0" distL="0" distR="0" wp14:anchorId="3137D3DC" wp14:editId="6F4E7B4D">
+                <wp:extent cx="5760720" cy="1433830"/>
+                <wp:effectExtent l="0" t="0" r="5080" b="1270"/>
+                <wp:docPr id="351654845" name="Image 3" descr="Une image contenant texte, capture d’écran, Police&#10;&#10;Le contenu généré par l’IA peut être incorrect."/>
+                <wp:cNvGraphicFramePr>
+                  <a:graphicFrameLocks xmlns:a="http://schemas.openxmlformats.org/drawingml/2006/main" noChangeAspect="1"/>
+                </wp:cNvGraphicFramePr>
+                <a:graphic xmlns:a="http://schemas.openxmlformats.org/drawingml/2006/main">
+                  <a:graphicData uri="http://schemas.openxmlformats.org/drawingml/2006/picture">
+                    <pic:pic xmlns:pic="http://schemas.openxmlformats.org/drawingml/2006/picture">
+                      <pic:nvPicPr>
+                        <pic:cNvPr id="351654845" name="Image 3" descr="Une image contenant texte, capture d’écran, Police&#10;&#10;Le contenu généré par l’IA peut être incorrect."/>
+                        <pic:cNvPicPr/>
+                      </pic:nvPicPr>
+                      <pic:blipFill>
+                        <a:blip r:embed="rId14">
+                          <a:extLst>
+                            <a:ext uri="{28A0092B-C50C-407E-A947-70E740481C1C}">
+                              <a14:useLocalDpi xmlns:a14="http://schemas.microsoft.com/office/drawing/2010/main" val="0"/>
+                            </a:ext>
+                          </a:extLst>
+                        </a:blip>
+                        <a:stretch>
+                          <a:fillRect/>
+                        </a:stretch>
+                      </pic:blipFill>
+                      <pic:spPr>
+                        <a:xfrm>
+                          <a:off x="0" y="0"/>
+                          <a:ext cx="5760720" cy="1433830"/>
+                        </a:xfrm>
+                        <a:prstGeom prst="rect">
+                          <a:avLst/>
+                        </a:prstGeom>
+                      </pic:spPr>
+                    </pic:pic>
+                  </a:graphicData>
+                </a:graphic>
+              </wp:inline>
+            </w:drawing>
+          </w:r>
+        </w:p>
+        <w:p>
+          <w:pPr>
+            <w:jc w:val="both"/>
+            <w:rPr>
+              <w:sz w:val="20"/>
+              <w:szCs w:val="20"/>
+            </w:rPr>
+          </w:pPr>
+          <w:r>
+            <w:rPr>
+              <w:sz w:val="20"/>
+              <w:szCs w:val="20"/>
+            </w:rPr>
+            <w:t>Cette requête est une extraction standard et complète des données de température, conçue pour alimenter une visualisation temporelle. Elle récupère toutes les mesures du champ "</w:t>
+          </w:r>
+          <w:proofErr w:type="spellStart"/>
+          <w:r>
+            <w:rPr>
+              <w:sz w:val="20"/>
+              <w:szCs w:val="20"/>
+            </w:rPr>
+            <w:t>temperature</w:t>
+          </w:r>
+          <w:proofErr w:type="spellEnd"/>
+          <w:r>
+            <w:rPr>
+              <w:sz w:val="20"/>
+              <w:szCs w:val="20"/>
+            </w:rPr>
+            <w:t xml:space="preserve">" dans le </w:t>
+          </w:r>
+          <w:proofErr w:type="spellStart"/>
+          <w:r>
+            <w:rPr>
+              <w:sz w:val="20"/>
+              <w:szCs w:val="20"/>
+            </w:rPr>
+            <w:t>bucket</w:t>
+          </w:r>
+          <w:proofErr w:type="spellEnd"/>
+          <w:r>
+            <w:rPr>
+              <w:sz w:val="20"/>
+              <w:szCs w:val="20"/>
+            </w:rPr>
+            <w:t xml:space="preserve"> "</w:t>
+          </w:r>
+          <w:proofErr w:type="spellStart"/>
+          <w:r>
+            <w:rPr>
+              <w:sz w:val="20"/>
+              <w:szCs w:val="20"/>
+            </w:rPr>
+            <w:t>airsensor</w:t>
+          </w:r>
+          <w:proofErr w:type="spellEnd"/>
+          <w:r>
+            <w:rPr>
+              <w:sz w:val="20"/>
+              <w:szCs w:val="20"/>
+            </w:rPr>
+            <w:t xml:space="preserve">", sans appliquer de filtre de seuil restrictif comme vu précédemment. Son utilité principale réside dans la fonction </w:t>
+          </w:r>
+          <w:proofErr w:type="spellStart"/>
+          <w:r>
+            <w:rPr>
+              <w:sz w:val="20"/>
+              <w:szCs w:val="20"/>
+            </w:rPr>
+            <w:t>aggregateWindow</w:t>
+          </w:r>
+          <w:proofErr w:type="spellEnd"/>
+          <w:r>
+            <w:rPr>
+              <w:sz w:val="20"/>
+              <w:szCs w:val="20"/>
+            </w:rPr>
+            <w:t xml:space="preserve"> utilisant la moyenne (</w:t>
+          </w:r>
+          <w:proofErr w:type="spellStart"/>
+          <w:r>
+            <w:rPr>
+              <w:sz w:val="20"/>
+              <w:szCs w:val="20"/>
+            </w:rPr>
+            <w:t>mean</w:t>
+          </w:r>
+          <w:proofErr w:type="spellEnd"/>
+          <w:r>
+            <w:rPr>
+              <w:sz w:val="20"/>
+              <w:szCs w:val="20"/>
+            </w:rPr>
+            <w:t>), qui permet de synchroniser et de lisser les données de tous les capteurs actifs sur les mêmes intervalles de temps. Elle sert de base de données brute et propre pour permettre au graphique d'afficher simultanément l'évolution de multiples capteurs sans que le bruit de mesure ne rende la lecture impossible.</w:t>
+          </w:r>
+        </w:p>
+        <w:p>
+          <w:pPr>
+            <w:rPr>
+              <w:sz w:val="20"/>
+              <w:szCs w:val="20"/>
+            </w:rPr>
+          </w:pPr>
+        </w:p>
+        <w:p>
+          <w:pPr>
+            <w:rPr>
+              <w:sz w:val="20"/>
+              <w:szCs w:val="20"/>
+            </w:rPr>
+          </w:pPr>
+          <w:r>
+            <w:rPr>
+              <w:noProof/>
+              <w:sz w:val="20"/>
+              <w:szCs w:val="20"/>
+            </w:rPr>
+            <w:drawing>
+              <wp:inline distT="0" distB="0" distL="0" distR="0" wp14:anchorId="11D92C6E" wp14:editId="09ABBE2D">
+                <wp:extent cx="5760720" cy="2245360"/>
+                <wp:effectExtent l="0" t="0" r="5080" b="2540"/>
+                <wp:docPr id="536394230" name="Image 4" descr="Une image contenant Logiciel multimédia, capture d’écran&#10;&#10;Le contenu généré par l’IA peut être incorrect."/>
+                <wp:cNvGraphicFramePr>
+                  <a:graphicFrameLocks xmlns:a="http://schemas.openxmlformats.org/drawingml/2006/main" noChangeAspect="1"/>
+                </wp:cNvGraphicFramePr>
+                <a:graphic xmlns:a="http://schemas.openxmlformats.org/drawingml/2006/main">
+                  <a:graphicData uri="http://schemas.openxmlformats.org/drawingml/2006/picture">
+                    <pic:pic xmlns:pic="http://schemas.openxmlformats.org/drawingml/2006/picture">
+                      <pic:nvPicPr>
+                        <pic:cNvPr id="536394230" name="Image 4" descr="Une image contenant Logiciel multimédia, capture d’écran&#10;&#10;Le contenu généré par l’IA peut être incorrect."/>
+                        <pic:cNvPicPr/>
+                      </pic:nvPicPr>
+                      <pic:blipFill>
+                        <a:blip r:embed="rId15" cstate="print">
+                          <a:extLst>
+                            <a:ext uri="{28A0092B-C50C-407E-A947-70E740481C1C}">
+                              <a14:useLocalDpi xmlns:a14="http://schemas.microsoft.com/office/drawing/2010/main" val="0"/>
+                            </a:ext>
+                          </a:extLst>
+                        </a:blip>
+                        <a:stretch>
+                          <a:fillRect/>
+                        </a:stretch>
+                      </pic:blipFill>
+                      <pic:spPr>
+                        <a:xfrm>
+                          <a:off x="0" y="0"/>
+                          <a:ext cx="5760720" cy="2245360"/>
+                        </a:xfrm>
+                        <a:prstGeom prst="rect">
+                          <a:avLst/>
+                        </a:prstGeom>
+                      </pic:spPr>
+                    </pic:pic>
+                  </a:graphicData>
+                </a:graphic>
+              </wp:inline>
+            </w:drawing>
+          </w:r>
+        </w:p>
+        <w:p>
+          <w:pPr>
+            <w:jc w:val="both"/>
+            <w:rPr>
+              <w:sz w:val="20"/>
+              <w:szCs w:val="20"/>
+            </w:rPr>
+          </w:pPr>
+          <w:r>
+            <w:rPr>
+              <w:sz w:val="20"/>
+              <w:szCs w:val="20"/>
+            </w:rPr>
+            <w:t>Le graphique, intitulé "</w:t>
+          </w:r>
+          <w:proofErr w:type="spellStart"/>
+          <w:r>
+            <w:rPr>
+              <w:sz w:val="20"/>
+              <w:szCs w:val="20"/>
+            </w:rPr>
+            <w:t>Heatmap</w:t>
+          </w:r>
+          <w:proofErr w:type="spellEnd"/>
+          <w:r>
+            <w:rPr>
+              <w:sz w:val="20"/>
+              <w:szCs w:val="20"/>
+            </w:rPr>
+            <w:t xml:space="preserve"> Température", sert à visualiser la densité et la distribution des températures au fil du temps. Contrairement à un graphique linéaire classique qui serait illisible avec autant de capteurs, ou à un histogramme qui ne montre pas l'évolution temporelle, cette carte thermique combine les deux avantages. Elle révèle clairement trois "bandes" horizontales distinctes (vers 71-72, 73-74, et &gt;75) qui restent stables de 02h00 à 03h00. Les points lumineux (jaunes/oranges) indiquent là où les relevés sont les plus fréquents, confirmant que la séparation des zones climatiques dans la pièce est constante et ne fluctue pas durant l'heure écoulée.</w:t>
+          </w:r>
+        </w:p>
+        <w:p>
+          <w:pPr>
             <w:rPr>
               <w:b/>
               <w:bCs/>
               <w:sz w:val="20"/>
               <w:szCs w:val="20"/>
             </w:rPr>
-            <w:t>1.2.6 Groupement par tag</w:t>
-          </w:r>
-        </w:p>
-        <w:p>
-          <w:pPr>
-            <w:rPr>
-              <w:sz w:val="20"/>
-              <w:szCs w:val="20"/>
-            </w:rPr>
-          </w:pPr>
-          <w:r>
-            <w:rPr>
-              <w:sz w:val="20"/>
-              <w:szCs w:val="20"/>
-            </w:rPr>
-            <w:t>Le groupement permet d'analyser les données selon différentes dimensions.</w:t>
-          </w:r>
+          </w:pPr>
         </w:p>
         <w:p>
           <w:pPr>
@@ -6487,40 +7025,40 @@
               <w:szCs w:val="20"/>
             </w:rPr>
           </w:pPr>
-        </w:p>
-        <w:p>
-          <w:pPr>
+          <w:r>
             <w:rPr>
               <w:b/>
               <w:bCs/>
               <w:sz w:val="20"/>
               <w:szCs w:val="20"/>
             </w:rPr>
-          </w:pPr>
-          <w:r>
+            <w:t>1.2.6 Groupement par tag</w:t>
+          </w:r>
+        </w:p>
+        <w:p>
+          <w:pPr>
+            <w:rPr>
+              <w:sz w:val="20"/>
+              <w:szCs w:val="20"/>
+            </w:rPr>
+          </w:pPr>
+          <w:r>
+            <w:rPr>
+              <w:sz w:val="20"/>
+              <w:szCs w:val="20"/>
+            </w:rPr>
+            <w:t>Le groupement permet d'analyser les données selon différentes dimensions.</w:t>
+          </w:r>
+        </w:p>
+        <w:p>
+          <w:pPr>
             <w:rPr>
               <w:b/>
               <w:bCs/>
               <w:sz w:val="20"/>
               <w:szCs w:val="20"/>
             </w:rPr>
-            <w:t>1.2.7 Calcul de statistiques multiples</w:t>
-          </w:r>
-        </w:p>
-        <w:p>
-          <w:pPr>
-            <w:rPr>
-              <w:sz w:val="20"/>
-              <w:szCs w:val="20"/>
-            </w:rPr>
-          </w:pPr>
-          <w:r>
-            <w:rPr>
-              <w:sz w:val="20"/>
-              <w:szCs w:val="20"/>
-            </w:rPr>
-            <w:t>Les requêtes peuvent combiner plusieurs opérations d'agrégation pour obtenir des statistiques complètes.</w:t>
-          </w:r>
+          </w:pPr>
         </w:p>
         <w:p>
           <w:pPr>
@@ -6531,40 +7069,41 @@
               <w:szCs w:val="20"/>
             </w:rPr>
           </w:pPr>
-        </w:p>
-        <w:p>
-          <w:pPr>
+          <w:r>
             <w:rPr>
               <w:b/>
               <w:bCs/>
               <w:sz w:val="20"/>
               <w:szCs w:val="20"/>
             </w:rPr>
-          </w:pPr>
-          <w:r>
+            <w:t>1.2.7 Calcul de statistiques multiples</w:t>
+          </w:r>
+        </w:p>
+        <w:p>
+          <w:pPr>
+            <w:rPr>
+              <w:sz w:val="20"/>
+              <w:szCs w:val="20"/>
+            </w:rPr>
+          </w:pPr>
+          <w:r>
+            <w:rPr>
+              <w:sz w:val="20"/>
+              <w:szCs w:val="20"/>
+            </w:rPr>
+            <w:lastRenderedPageBreak/>
+            <w:t>Les requêtes peuvent combiner plusieurs opérations d'agrégation pour obtenir des statistiques complètes.</w:t>
+          </w:r>
+        </w:p>
+        <w:p>
+          <w:pPr>
             <w:rPr>
               <w:b/>
               <w:bCs/>
               <w:sz w:val="20"/>
               <w:szCs w:val="20"/>
             </w:rPr>
-            <w:t>1.2.8 Requête multi-champs</w:t>
-          </w:r>
-        </w:p>
-        <w:p>
-          <w:pPr>
-            <w:rPr>
-              <w:sz w:val="20"/>
-              <w:szCs w:val="20"/>
-            </w:rPr>
-          </w:pPr>
-          <w:r>
-            <w:rPr>
-              <w:sz w:val="20"/>
-              <w:szCs w:val="20"/>
-            </w:rPr>
-            <w:t>Il est possible d'interroger plusieurs champs simultanément.</w:t>
-          </w:r>
+          </w:pPr>
         </w:p>
         <w:p>
           <w:pPr>
@@ -6575,56 +7114,40 @@
               <w:szCs w:val="20"/>
             </w:rPr>
           </w:pPr>
-        </w:p>
-        <w:p>
-          <w:pPr>
+          <w:r>
             <w:rPr>
               <w:b/>
               <w:bCs/>
               <w:sz w:val="20"/>
               <w:szCs w:val="20"/>
             </w:rPr>
-          </w:pPr>
-          <w:r>
+            <w:t>1.2.8 Requête multi-champs</w:t>
+          </w:r>
+        </w:p>
+        <w:p>
+          <w:pPr>
+            <w:rPr>
+              <w:sz w:val="20"/>
+              <w:szCs w:val="20"/>
+            </w:rPr>
+          </w:pPr>
+          <w:r>
+            <w:rPr>
+              <w:sz w:val="20"/>
+              <w:szCs w:val="20"/>
+            </w:rPr>
+            <w:t>Il est possible d'interroger plusieurs champs simultanément.</w:t>
+          </w:r>
+        </w:p>
+        <w:p>
+          <w:pPr>
             <w:rPr>
               <w:b/>
               <w:bCs/>
               <w:sz w:val="20"/>
               <w:szCs w:val="20"/>
             </w:rPr>
-            <w:t>1.2.9 Calcul de taux de variation</w:t>
-          </w:r>
-        </w:p>
-        <w:p>
-          <w:pPr>
-            <w:rPr>
-              <w:sz w:val="20"/>
-              <w:szCs w:val="20"/>
-            </w:rPr>
-          </w:pPr>
-          <w:r>
-            <w:rPr>
-              <w:sz w:val="20"/>
-              <w:szCs w:val="20"/>
-            </w:rPr>
-            <w:t xml:space="preserve">La fonction </w:t>
-          </w:r>
-          <w:proofErr w:type="spellStart"/>
-          <w:r>
-            <w:rPr>
-              <w:sz w:val="20"/>
-              <w:szCs w:val="20"/>
-            </w:rPr>
-            <w:t>derivative</w:t>
-          </w:r>
-          <w:proofErr w:type="spellEnd"/>
-          <w:r>
-            <w:rPr>
-              <w:sz w:val="20"/>
-              <w:szCs w:val="20"/>
-            </w:rPr>
-            <w:t xml:space="preserve"> permet de calculer le taux de variation entre les points de données.</w:t>
-          </w:r>
+          </w:pPr>
         </w:p>
         <w:p>
           <w:pPr>
@@ -6635,40 +7158,56 @@
               <w:szCs w:val="20"/>
             </w:rPr>
           </w:pPr>
-        </w:p>
-        <w:p>
-          <w:pPr>
+          <w:r>
             <w:rPr>
               <w:b/>
               <w:bCs/>
               <w:sz w:val="20"/>
               <w:szCs w:val="20"/>
             </w:rPr>
-          </w:pPr>
-          <w:r>
+            <w:t>1.2.9 Calcul de taux de variation</w:t>
+          </w:r>
+        </w:p>
+        <w:p>
+          <w:pPr>
+            <w:rPr>
+              <w:sz w:val="20"/>
+              <w:szCs w:val="20"/>
+            </w:rPr>
+          </w:pPr>
+          <w:r>
+            <w:rPr>
+              <w:sz w:val="20"/>
+              <w:szCs w:val="20"/>
+            </w:rPr>
+            <w:t xml:space="preserve">La fonction </w:t>
+          </w:r>
+          <w:proofErr w:type="spellStart"/>
+          <w:r>
+            <w:rPr>
+              <w:sz w:val="20"/>
+              <w:szCs w:val="20"/>
+            </w:rPr>
+            <w:t>derivative</w:t>
+          </w:r>
+          <w:proofErr w:type="spellEnd"/>
+          <w:r>
+            <w:rPr>
+              <w:sz w:val="20"/>
+              <w:szCs w:val="20"/>
+            </w:rPr>
+            <w:t xml:space="preserve"> permet de calculer le taux de variation entre les points de données.</w:t>
+          </w:r>
+        </w:p>
+        <w:p>
+          <w:pPr>
             <w:rPr>
               <w:b/>
               <w:bCs/>
               <w:sz w:val="20"/>
               <w:szCs w:val="20"/>
             </w:rPr>
-            <w:t>1.2.10 Détection de seuils</w:t>
-          </w:r>
-        </w:p>
-        <w:p>
-          <w:pPr>
-            <w:rPr>
-              <w:sz w:val="20"/>
-              <w:szCs w:val="20"/>
-            </w:rPr>
-          </w:pPr>
-          <w:r>
-            <w:rPr>
-              <w:sz w:val="20"/>
-              <w:szCs w:val="20"/>
-            </w:rPr>
-            <w:t>Les filtres conditionnels permettent d'identifier les valeurs dépassant certains seuils.</w:t>
-          </w:r>
+          </w:pPr>
         </w:p>
         <w:p>
           <w:pPr>
@@ -6679,50 +7218,50 @@
               <w:szCs w:val="20"/>
             </w:rPr>
           </w:pPr>
-        </w:p>
-        <w:p>
-          <w:pPr>
-            <w:pStyle w:val="Titre3"/>
-          </w:pPr>
-          <w:bookmarkStart w:id="18" w:name="_Toc219271409"/>
-          <w:r>
-            <w:t>Requêtes adaptées aux différents types de visualisations</w:t>
-          </w:r>
-          <w:bookmarkEnd w:id="18"/>
-        </w:p>
-        <w:p>
-          <w:pPr>
+          <w:r>
             <w:rPr>
               <w:b/>
               <w:bCs/>
               <w:sz w:val="20"/>
               <w:szCs w:val="20"/>
             </w:rPr>
-          </w:pPr>
-          <w:r>
+            <w:t>1.2.10 Détection de seuils</w:t>
+          </w:r>
+        </w:p>
+        <w:p>
+          <w:pPr>
+            <w:rPr>
+              <w:sz w:val="20"/>
+              <w:szCs w:val="20"/>
+            </w:rPr>
+          </w:pPr>
+          <w:r>
+            <w:rPr>
+              <w:sz w:val="20"/>
+              <w:szCs w:val="20"/>
+            </w:rPr>
+            <w:t>Les filtres conditionnels permettent d'identifier les valeurs dépassant certains seuils.</w:t>
+          </w:r>
+        </w:p>
+        <w:p>
+          <w:pPr>
             <w:rPr>
               <w:b/>
               <w:bCs/>
               <w:sz w:val="20"/>
               <w:szCs w:val="20"/>
             </w:rPr>
-            <w:t>1.3.1 Graphique en ligne (Line Chart)</w:t>
-          </w:r>
-        </w:p>
-        <w:p>
-          <w:pPr>
-            <w:rPr>
-              <w:sz w:val="20"/>
-              <w:szCs w:val="20"/>
-            </w:rPr>
-          </w:pPr>
-          <w:r>
-            <w:rPr>
-              <w:sz w:val="20"/>
-              <w:szCs w:val="20"/>
-            </w:rPr>
-            <w:t>Les graphiques en ligne sont adaptés à la visualisation de séries temporelles continues.</w:t>
-          </w:r>
+          </w:pPr>
+        </w:p>
+        <w:p>
+          <w:pPr>
+            <w:pStyle w:val="Titre3"/>
+          </w:pPr>
+          <w:bookmarkStart w:id="19" w:name="_Toc219278385"/>
+          <w:r>
+            <w:t>Requêtes adaptées aux différents types de visualisations</w:t>
+          </w:r>
+          <w:bookmarkEnd w:id="19"/>
         </w:p>
         <w:p>
           <w:pPr>
@@ -6733,40 +7272,40 @@
               <w:szCs w:val="20"/>
             </w:rPr>
           </w:pPr>
-        </w:p>
-        <w:p>
-          <w:pPr>
+          <w:r>
             <w:rPr>
               <w:b/>
               <w:bCs/>
               <w:sz w:val="20"/>
               <w:szCs w:val="20"/>
             </w:rPr>
-          </w:pPr>
-          <w:r>
+            <w:t>1.3.1 Graphique en ligne (Line Chart)</w:t>
+          </w:r>
+        </w:p>
+        <w:p>
+          <w:pPr>
+            <w:rPr>
+              <w:sz w:val="20"/>
+              <w:szCs w:val="20"/>
+            </w:rPr>
+          </w:pPr>
+          <w:r>
+            <w:rPr>
+              <w:sz w:val="20"/>
+              <w:szCs w:val="20"/>
+            </w:rPr>
+            <w:t>Les graphiques en ligne sont adaptés à la visualisation de séries temporelles continues.</w:t>
+          </w:r>
+        </w:p>
+        <w:p>
+          <w:pPr>
             <w:rPr>
               <w:b/>
               <w:bCs/>
               <w:sz w:val="20"/>
               <w:szCs w:val="20"/>
             </w:rPr>
-            <w:t>1.3.2 Graphique à barres (Bar Chart)</w:t>
-          </w:r>
-        </w:p>
-        <w:p>
-          <w:pPr>
-            <w:rPr>
-              <w:sz w:val="20"/>
-              <w:szCs w:val="20"/>
-            </w:rPr>
-          </w:pPr>
-          <w:r>
-            <w:rPr>
-              <w:sz w:val="20"/>
-              <w:szCs w:val="20"/>
-            </w:rPr>
-            <w:t>Les graphiques à barres conviennent aux comparaisons de valeurs agrégées sur des périodes discrètes.</w:t>
-          </w:r>
+          </w:pPr>
         </w:p>
         <w:p>
           <w:pPr>
@@ -6777,40 +7316,40 @@
               <w:szCs w:val="20"/>
             </w:rPr>
           </w:pPr>
-        </w:p>
-        <w:p>
-          <w:pPr>
+          <w:r>
             <w:rPr>
               <w:b/>
               <w:bCs/>
               <w:sz w:val="20"/>
               <w:szCs w:val="20"/>
             </w:rPr>
-          </w:pPr>
-          <w:r>
+            <w:t>1.3.2 Graphique à barres (Bar Chart)</w:t>
+          </w:r>
+        </w:p>
+        <w:p>
+          <w:pPr>
+            <w:rPr>
+              <w:sz w:val="20"/>
+              <w:szCs w:val="20"/>
+            </w:rPr>
+          </w:pPr>
+          <w:r>
+            <w:rPr>
+              <w:sz w:val="20"/>
+              <w:szCs w:val="20"/>
+            </w:rPr>
+            <w:t>Les graphiques à barres conviennent aux comparaisons de valeurs agrégées sur des périodes discrètes.</w:t>
+          </w:r>
+        </w:p>
+        <w:p>
+          <w:pPr>
             <w:rPr>
               <w:b/>
               <w:bCs/>
               <w:sz w:val="20"/>
               <w:szCs w:val="20"/>
             </w:rPr>
-            <w:t>1.3.3 Graphique de type Gauge (Jauge)</w:t>
-          </w:r>
-        </w:p>
-        <w:p>
-          <w:pPr>
-            <w:rPr>
-              <w:sz w:val="20"/>
-              <w:szCs w:val="20"/>
-            </w:rPr>
-          </w:pPr>
-          <w:r>
-            <w:rPr>
-              <w:sz w:val="20"/>
-              <w:szCs w:val="20"/>
-            </w:rPr>
-            <w:t>Les jauges permettent d'afficher une valeur actuelle ou récente.</w:t>
-          </w:r>
+          </w:pPr>
         </w:p>
         <w:p>
           <w:pPr>
@@ -6821,111 +7360,111 @@
               <w:szCs w:val="20"/>
             </w:rPr>
           </w:pPr>
-        </w:p>
-        <w:p>
-          <w:pPr>
+          <w:r>
             <w:rPr>
               <w:b/>
               <w:bCs/>
               <w:sz w:val="20"/>
               <w:szCs w:val="20"/>
             </w:rPr>
-          </w:pPr>
-          <w:r>
+            <w:t>1.3.3 Graphique de type Gauge (Jauge)</w:t>
+          </w:r>
+        </w:p>
+        <w:p>
+          <w:pPr>
+            <w:rPr>
+              <w:sz w:val="20"/>
+              <w:szCs w:val="20"/>
+            </w:rPr>
+          </w:pPr>
+          <w:r>
+            <w:rPr>
+              <w:sz w:val="20"/>
+              <w:szCs w:val="20"/>
+            </w:rPr>
+            <w:t>Les jauges permettent d'afficher une valeur actuelle ou récente.</w:t>
+          </w:r>
+        </w:p>
+        <w:p>
+          <w:pPr>
             <w:rPr>
               <w:b/>
               <w:bCs/>
               <w:sz w:val="20"/>
               <w:szCs w:val="20"/>
             </w:rPr>
-            <w:t xml:space="preserve">1.3.4 Graphique </w:t>
-          </w:r>
-          <w:proofErr w:type="spellStart"/>
-          <w:r>
+          </w:pPr>
+        </w:p>
+        <w:p>
+          <w:pPr>
             <w:rPr>
               <w:b/>
               <w:bCs/>
               <w:sz w:val="20"/>
               <w:szCs w:val="20"/>
             </w:rPr>
-            <w:t>Heatmap</w:t>
-          </w:r>
-          <w:proofErr w:type="spellEnd"/>
-        </w:p>
-        <w:p>
-          <w:pPr>
-            <w:rPr>
-              <w:sz w:val="20"/>
-              <w:szCs w:val="20"/>
-            </w:rPr>
-          </w:pPr>
-          <w:r>
-            <w:rPr>
-              <w:sz w:val="20"/>
-              <w:szCs w:val="20"/>
-            </w:rPr>
-            <w:t xml:space="preserve">Les </w:t>
-          </w:r>
-          <w:proofErr w:type="spellStart"/>
-          <w:r>
-            <w:rPr>
-              <w:sz w:val="20"/>
-              <w:szCs w:val="20"/>
-            </w:rPr>
-            <w:t>heatmaps</w:t>
-          </w:r>
-          <w:proofErr w:type="spellEnd"/>
-          <w:r>
-            <w:rPr>
-              <w:sz w:val="20"/>
-              <w:szCs w:val="20"/>
-            </w:rPr>
-            <w:t xml:space="preserve"> visualisent l'intensité des valeurs sur deux dimensions (temps et catégorie).</w:t>
-          </w:r>
-        </w:p>
-        <w:p>
-          <w:pPr>
+          </w:pPr>
+          <w:r>
             <w:rPr>
               <w:b/>
               <w:bCs/>
               <w:sz w:val="20"/>
               <w:szCs w:val="20"/>
             </w:rPr>
-          </w:pPr>
-        </w:p>
-        <w:p>
-          <w:pPr>
+            <w:t xml:space="preserve">1.3.4 Graphique </w:t>
+          </w:r>
+          <w:proofErr w:type="spellStart"/>
+          <w:r>
             <w:rPr>
               <w:b/>
               <w:bCs/>
               <w:sz w:val="20"/>
               <w:szCs w:val="20"/>
             </w:rPr>
-          </w:pPr>
-          <w:r>
+            <w:t>Heatmap</w:t>
+          </w:r>
+          <w:proofErr w:type="spellEnd"/>
+        </w:p>
+        <w:p>
+          <w:pPr>
+            <w:rPr>
+              <w:sz w:val="20"/>
+              <w:szCs w:val="20"/>
+            </w:rPr>
+          </w:pPr>
+          <w:r>
+            <w:rPr>
+              <w:sz w:val="20"/>
+              <w:szCs w:val="20"/>
+            </w:rPr>
+            <w:t xml:space="preserve">Les </w:t>
+          </w:r>
+          <w:proofErr w:type="spellStart"/>
+          <w:r>
+            <w:rPr>
+              <w:sz w:val="20"/>
+              <w:szCs w:val="20"/>
+            </w:rPr>
+            <w:t>heatmaps</w:t>
+          </w:r>
+          <w:proofErr w:type="spellEnd"/>
+          <w:r>
+            <w:rPr>
+              <w:sz w:val="20"/>
+              <w:szCs w:val="20"/>
+            </w:rPr>
+            <w:t xml:space="preserve"> visualisent l'intensité des valeurs sur deux dimensions (temps et catégorie).</w:t>
+          </w:r>
+        </w:p>
+        <w:p>
+          <w:pPr>
             <w:rPr>
               <w:b/>
               <w:bCs/>
               <w:sz w:val="20"/>
               <w:szCs w:val="20"/>
             </w:rPr>
-            <w:t>1.3.5 Graphique multi-séries</w:t>
-          </w:r>
-        </w:p>
-        <w:p>
-          <w:pPr>
-            <w:rPr>
-              <w:sz w:val="20"/>
-              <w:szCs w:val="20"/>
-            </w:rPr>
-          </w:pPr>
-          <w:r>
-            <w:rPr>
-              <w:sz w:val="20"/>
-              <w:szCs w:val="20"/>
-            </w:rPr>
-            <w:t>La visualisation de plusieurs séries simultanément permet les comparaisons.</w:t>
-          </w:r>
+          </w:pPr>
         </w:p>
         <w:p>
           <w:pPr>
@@ -6936,16 +7475,30 @@
               <w:szCs w:val="20"/>
             </w:rPr>
           </w:pPr>
-        </w:p>
-        <w:p>
-          <w:pPr>
+          <w:r>
             <w:rPr>
               <w:b/>
               <w:bCs/>
               <w:sz w:val="20"/>
               <w:szCs w:val="20"/>
             </w:rPr>
-          </w:pPr>
+            <w:t>1.3.5 Graphique multi-séries</w:t>
+          </w:r>
+        </w:p>
+        <w:p>
+          <w:pPr>
+            <w:rPr>
+              <w:sz w:val="20"/>
+              <w:szCs w:val="20"/>
+            </w:rPr>
+          </w:pPr>
+          <w:r>
+            <w:rPr>
+              <w:sz w:val="20"/>
+              <w:szCs w:val="20"/>
+            </w:rPr>
+            <w:t>La visualisation de plusieurs séries simultanément permet les comparaisons.</w:t>
+          </w:r>
         </w:p>
         <w:p>
           <w:pPr>
@@ -6999,70 +7552,6 @@
         </w:p>
         <w:p>
           <w:pPr>
-            <w:pStyle w:val="Titre3"/>
-          </w:pPr>
-          <w:bookmarkStart w:id="19" w:name="_Toc219271410"/>
-          <w:r>
-            <w:t>Monitoring de température</w:t>
-          </w:r>
-          <w:r>
-            <w:t>s</w:t>
-          </w:r>
-          <w:bookmarkEnd w:id="19"/>
-        </w:p>
-        <w:p>
-          <w:pPr>
-            <w:rPr>
-              <w:sz w:val="20"/>
-              <w:szCs w:val="20"/>
-            </w:rPr>
-          </w:pPr>
-          <w:r>
-            <w:rPr>
-              <w:sz w:val="20"/>
-              <w:szCs w:val="20"/>
-            </w:rPr>
-            <w:t xml:space="preserve">L'exemple suivant illustre la création d'un </w:t>
-          </w:r>
-          <w:proofErr w:type="spellStart"/>
-          <w:r>
-            <w:rPr>
-              <w:sz w:val="20"/>
-              <w:szCs w:val="20"/>
-            </w:rPr>
-            <w:t>dashboard</w:t>
-          </w:r>
-          <w:proofErr w:type="spellEnd"/>
-          <w:r>
-            <w:rPr>
-              <w:sz w:val="20"/>
-              <w:szCs w:val="20"/>
-            </w:rPr>
-            <w:t xml:space="preserve"> complet pour le monitoring de température avec plusieurs visualisations complémentaires.</w:t>
-          </w:r>
-        </w:p>
-        <w:p>
-          <w:r>
-            <w:t>Requête 1 : Température moyenne par heure</w:t>
-          </w:r>
-        </w:p>
-        <w:p>
-          <w:pPr>
-            <w:rPr>
-              <w:sz w:val="20"/>
-              <w:szCs w:val="20"/>
-            </w:rPr>
-          </w:pPr>
-          <w:r>
-            <w:rPr>
-              <w:sz w:val="20"/>
-              <w:szCs w:val="20"/>
-            </w:rPr>
-            <w:t>Cette visualisation présente l'évolution de la température moyenne sur une période de 24 heures avec agrégation horaire.</w:t>
-          </w:r>
-        </w:p>
-        <w:p>
-          <w:pPr>
             <w:rPr>
               <w:b/>
               <w:bCs/>
@@ -7072,54 +7561,6 @@
           </w:pPr>
         </w:p>
         <w:p>
-          <w:r>
-            <w:t>Requête 2 : Température actuelle</w:t>
-          </w:r>
-        </w:p>
-        <w:p>
-          <w:pPr>
-            <w:rPr>
-              <w:sz w:val="20"/>
-              <w:szCs w:val="20"/>
-            </w:rPr>
-          </w:pPr>
-          <w:r>
-            <w:rPr>
-              <w:sz w:val="20"/>
-              <w:szCs w:val="20"/>
-            </w:rPr>
-            <w:t>Cette visualisation affiche la dernière valeur de température mesurée, utile pour un monitoring en temps réel.</w:t>
-          </w:r>
-        </w:p>
-        <w:p>
-          <w:pPr>
-            <w:rPr>
-              <w:sz w:val="20"/>
-              <w:szCs w:val="20"/>
-            </w:rPr>
-          </w:pPr>
-        </w:p>
-        <w:p>
-          <w:r>
-            <w:t>Requête 3 : Température par location</w:t>
-          </w:r>
-        </w:p>
-        <w:p>
-          <w:pPr>
-            <w:rPr>
-              <w:sz w:val="20"/>
-              <w:szCs w:val="20"/>
-            </w:rPr>
-          </w:pPr>
-          <w:r>
-            <w:rPr>
-              <w:sz w:val="20"/>
-              <w:szCs w:val="20"/>
-            </w:rPr>
-            <w:t>Cette visualisation permet de comparer les températures entre différentes localisations.</w:t>
-          </w:r>
-        </w:p>
-        <w:p>
           <w:pPr>
             <w:rPr>
               <w:b/>
@@ -7130,39 +7571,125 @@
           </w:pPr>
         </w:p>
         <w:p>
-          <w:r>
-            <w:t>Requête 4 : Statistiques agrégées</w:t>
-          </w:r>
-        </w:p>
-        <w:p>
-          <w:pPr>
-            <w:rPr>
-              <w:sz w:val="20"/>
-              <w:szCs w:val="20"/>
-            </w:rPr>
-          </w:pPr>
-          <w:r>
-            <w:rPr>
-              <w:sz w:val="20"/>
-              <w:szCs w:val="20"/>
-            </w:rPr>
-            <w:t>Cette visualisation présente plusieurs statistiques (minimum, maximum, moyenne) sur une période</w:t>
-          </w:r>
-          <w:r>
+          <w:pPr>
+            <w:pStyle w:val="Titre3"/>
+          </w:pPr>
+          <w:bookmarkStart w:id="20" w:name="_Toc219278386"/>
+          <w:r>
+            <w:t>Monitoring de température</w:t>
+          </w:r>
+          <w:r>
+            <w:t>s</w:t>
+          </w:r>
+          <w:bookmarkEnd w:id="20"/>
+        </w:p>
+        <w:p>
+          <w:pPr>
+            <w:rPr>
+              <w:sz w:val="20"/>
+              <w:szCs w:val="20"/>
+            </w:rPr>
+          </w:pPr>
+          <w:r>
+            <w:rPr>
+              <w:sz w:val="20"/>
+              <w:szCs w:val="20"/>
+            </w:rPr>
+            <w:t xml:space="preserve">L'exemple suivant illustre la création d'un </w:t>
+          </w:r>
+          <w:proofErr w:type="spellStart"/>
+          <w:r>
+            <w:rPr>
+              <w:sz w:val="20"/>
+              <w:szCs w:val="20"/>
+            </w:rPr>
+            <w:t>dashboard</w:t>
+          </w:r>
+          <w:proofErr w:type="spellEnd"/>
+          <w:r>
+            <w:rPr>
+              <w:sz w:val="20"/>
+              <w:szCs w:val="20"/>
+            </w:rPr>
+            <w:t xml:space="preserve"> complet pour le monitoring de température avec plusieurs visualisations complémentaires.</w:t>
+          </w:r>
+        </w:p>
+        <w:p>
+          <w:r>
+            <w:t>Requête 1 : Température moyenne par heure</w:t>
+          </w:r>
+        </w:p>
+        <w:p>
+          <w:pPr>
+            <w:rPr>
+              <w:sz w:val="20"/>
+              <w:szCs w:val="20"/>
+            </w:rPr>
+          </w:pPr>
+          <w:r>
+            <w:rPr>
+              <w:sz w:val="20"/>
+              <w:szCs w:val="20"/>
+            </w:rPr>
+            <w:t>Cette visualisation présente l'évolution de la température moyenne sur une période de 24 heures avec agrégation horaire.</w:t>
+          </w:r>
+        </w:p>
+        <w:p>
+          <w:pPr>
             <w:rPr>
               <w:b/>
               <w:bCs/>
               <w:sz w:val="20"/>
               <w:szCs w:val="20"/>
             </w:rPr>
-            <w:t xml:space="preserve"> </w:t>
-          </w:r>
-          <w:r>
-            <w:rPr>
-              <w:sz w:val="20"/>
-              <w:szCs w:val="20"/>
-            </w:rPr>
-            <w:t>donnée.</w:t>
+          </w:pPr>
+        </w:p>
+        <w:p>
+          <w:r>
+            <w:t>Requête 2 : Température actuelle</w:t>
+          </w:r>
+        </w:p>
+        <w:p>
+          <w:pPr>
+            <w:rPr>
+              <w:sz w:val="20"/>
+              <w:szCs w:val="20"/>
+            </w:rPr>
+          </w:pPr>
+          <w:r>
+            <w:rPr>
+              <w:sz w:val="20"/>
+              <w:szCs w:val="20"/>
+            </w:rPr>
+            <w:t>Cette visualisation affiche la dernière valeur de température mesurée, utile pour un monitoring en temps réel.</w:t>
+          </w:r>
+        </w:p>
+        <w:p>
+          <w:pPr>
+            <w:rPr>
+              <w:sz w:val="20"/>
+              <w:szCs w:val="20"/>
+            </w:rPr>
+          </w:pPr>
+        </w:p>
+        <w:p>
+          <w:r>
+            <w:t>Requête 3 : Température par location</w:t>
+          </w:r>
+        </w:p>
+        <w:p>
+          <w:pPr>
+            <w:rPr>
+              <w:sz w:val="20"/>
+              <w:szCs w:val="20"/>
+            </w:rPr>
+          </w:pPr>
+          <w:r>
+            <w:rPr>
+              <w:sz w:val="20"/>
+              <w:szCs w:val="20"/>
+            </w:rPr>
+            <w:t>Cette visualisation permet de comparer les températures entre différentes localisations.</w:t>
           </w:r>
         </w:p>
         <w:p>
@@ -7176,14 +7703,40 @@
           </w:pPr>
         </w:p>
         <w:p>
-          <w:pPr>
+          <w:r>
+            <w:t>Requête 4 : Statistiques agrégées</w:t>
+          </w:r>
+        </w:p>
+        <w:p>
+          <w:pPr>
+            <w:rPr>
+              <w:sz w:val="20"/>
+              <w:szCs w:val="20"/>
+            </w:rPr>
+          </w:pPr>
+          <w:r>
+            <w:rPr>
+              <w:sz w:val="20"/>
+              <w:szCs w:val="20"/>
+            </w:rPr>
+            <w:t>Cette visualisation présente plusieurs statistiques (minimum, maximum, moyenne) sur une période</w:t>
+          </w:r>
+          <w:r>
             <w:rPr>
               <w:b/>
               <w:bCs/>
               <w:sz w:val="20"/>
               <w:szCs w:val="20"/>
             </w:rPr>
-          </w:pPr>
+            <w:t xml:space="preserve"> </w:t>
+          </w:r>
+          <w:r>
+            <w:rPr>
+              <w:sz w:val="20"/>
+              <w:szCs w:val="20"/>
+            </w:rPr>
+            <w:t>donnée.</w:t>
+          </w:r>
         </w:p>
         <w:p>
           <w:pPr>
@@ -7307,13 +7860,33 @@
         </w:p>
         <w:p>
           <w:pPr>
+            <w:rPr>
+              <w:b/>
+              <w:bCs/>
+              <w:sz w:val="20"/>
+              <w:szCs w:val="20"/>
+            </w:rPr>
+          </w:pPr>
+        </w:p>
+        <w:p>
+          <w:pPr>
+            <w:rPr>
+              <w:b/>
+              <w:bCs/>
+              <w:sz w:val="20"/>
+              <w:szCs w:val="20"/>
+            </w:rPr>
+          </w:pPr>
+        </w:p>
+        <w:p>
+          <w:pPr>
             <w:pStyle w:val="Titre1"/>
           </w:pPr>
-          <w:bookmarkStart w:id="20" w:name="_Toc219271411"/>
+          <w:bookmarkStart w:id="21" w:name="_Toc219278387"/>
           <w:r>
             <w:t>Conclusion</w:t>
           </w:r>
-          <w:bookmarkEnd w:id="20"/>
+          <w:bookmarkEnd w:id="21"/>
         </w:p>
         <w:p>
           <w:pPr>
@@ -12716,6 +13289,7 @@
     <w:rsid w:val="009A6620"/>
     <w:rsid w:val="00A81EE0"/>
     <w:rsid w:val="00BF6AD5"/>
+    <w:rsid w:val="00D0243A"/>
     <w:rsid w:val="00D41ABF"/>
     <w:rsid w:val="00F2598C"/>
   </w:rsids>

</xml_diff>

<commit_message>
Avancement jusqu'a requet 9
</commit_message>
<xml_diff>
--- a/TP3 - InfluxDB & Grafana/CETINKAYA_FADHLOUNE.docx
+++ b/TP3 - InfluxDB & Grafana/CETINKAYA_FADHLOUNE.docx
@@ -7025,162 +7025,150 @@
               <w:szCs w:val="20"/>
             </w:rPr>
           </w:pPr>
-          <w:r>
-            <w:rPr>
-              <w:b/>
-              <w:bCs/>
-              <w:sz w:val="20"/>
-              <w:szCs w:val="20"/>
-            </w:rPr>
-            <w:t>1.2.6 Groupement par tag</w:t>
-          </w:r>
-        </w:p>
-        <w:p>
-          <w:pPr>
-            <w:rPr>
-              <w:sz w:val="20"/>
-              <w:szCs w:val="20"/>
-            </w:rPr>
-          </w:pPr>
-          <w:r>
-            <w:rPr>
-              <w:sz w:val="20"/>
-              <w:szCs w:val="20"/>
-            </w:rPr>
-            <w:t>Le groupement permet d'analyser les données selon différentes dimensions.</w:t>
-          </w:r>
-        </w:p>
-        <w:p>
-          <w:pPr>
-            <w:rPr>
-              <w:b/>
-              <w:bCs/>
-              <w:sz w:val="20"/>
-              <w:szCs w:val="20"/>
-            </w:rPr>
-          </w:pPr>
-        </w:p>
-        <w:p>
-          <w:pPr>
-            <w:rPr>
-              <w:b/>
-              <w:bCs/>
-              <w:sz w:val="20"/>
-              <w:szCs w:val="20"/>
-            </w:rPr>
-          </w:pPr>
-          <w:r>
-            <w:rPr>
-              <w:b/>
-              <w:bCs/>
-              <w:sz w:val="20"/>
-              <w:szCs w:val="20"/>
-            </w:rPr>
-            <w:t>1.2.7 Calcul de statistiques multiples</w:t>
-          </w:r>
-        </w:p>
-        <w:p>
-          <w:pPr>
-            <w:rPr>
-              <w:sz w:val="20"/>
-              <w:szCs w:val="20"/>
-            </w:rPr>
-          </w:pPr>
-          <w:r>
-            <w:rPr>
+        </w:p>
+        <w:p>
+          <w:pPr>
+            <w:rPr>
+              <w:b/>
+              <w:bCs/>
+              <w:sz w:val="20"/>
+              <w:szCs w:val="20"/>
+            </w:rPr>
+          </w:pPr>
+        </w:p>
+        <w:p>
+          <w:pPr>
+            <w:rPr>
+              <w:b/>
+              <w:bCs/>
+              <w:sz w:val="20"/>
+              <w:szCs w:val="20"/>
+            </w:rPr>
+          </w:pPr>
+        </w:p>
+        <w:p>
+          <w:pPr>
+            <w:rPr>
+              <w:b/>
+              <w:bCs/>
+              <w:sz w:val="20"/>
+              <w:szCs w:val="20"/>
+            </w:rPr>
+          </w:pPr>
+        </w:p>
+        <w:p>
+          <w:pPr>
+            <w:rPr>
+              <w:b/>
+              <w:bCs/>
+              <w:sz w:val="20"/>
+              <w:szCs w:val="20"/>
+            </w:rPr>
+          </w:pPr>
+        </w:p>
+        <w:p>
+          <w:pPr>
+            <w:rPr>
+              <w:b/>
+              <w:bCs/>
+              <w:sz w:val="20"/>
+              <w:szCs w:val="20"/>
+            </w:rPr>
+          </w:pPr>
+          <w:r>
+            <w:rPr>
+              <w:b/>
+              <w:bCs/>
               <w:sz w:val="20"/>
               <w:szCs w:val="20"/>
             </w:rPr>
             <w:lastRenderedPageBreak/>
-            <w:t>Les requêtes peuvent combiner plusieurs opérations d'agrégation pour obtenir des statistiques complètes.</w:t>
-          </w:r>
-        </w:p>
-        <w:p>
-          <w:pPr>
-            <w:rPr>
-              <w:b/>
-              <w:bCs/>
-              <w:sz w:val="20"/>
-              <w:szCs w:val="20"/>
-            </w:rPr>
-          </w:pPr>
-        </w:p>
-        <w:p>
-          <w:pPr>
-            <w:rPr>
-              <w:b/>
-              <w:bCs/>
-              <w:sz w:val="20"/>
-              <w:szCs w:val="20"/>
-            </w:rPr>
-          </w:pPr>
-          <w:r>
-            <w:rPr>
-              <w:b/>
-              <w:bCs/>
-              <w:sz w:val="20"/>
-              <w:szCs w:val="20"/>
-            </w:rPr>
-            <w:t>1.2.8 Requête multi-champs</w:t>
-          </w:r>
-        </w:p>
-        <w:p>
-          <w:pPr>
-            <w:rPr>
-              <w:sz w:val="20"/>
-              <w:szCs w:val="20"/>
-            </w:rPr>
-          </w:pPr>
-          <w:r>
-            <w:rPr>
-              <w:sz w:val="20"/>
-              <w:szCs w:val="20"/>
-            </w:rPr>
-            <w:t>Il est possible d'interroger plusieurs champs simultanément.</w:t>
-          </w:r>
-        </w:p>
-        <w:p>
-          <w:pPr>
-            <w:rPr>
-              <w:b/>
-              <w:bCs/>
-              <w:sz w:val="20"/>
-              <w:szCs w:val="20"/>
-            </w:rPr>
-          </w:pPr>
-        </w:p>
-        <w:p>
-          <w:pPr>
-            <w:rPr>
-              <w:b/>
-              <w:bCs/>
-              <w:sz w:val="20"/>
-              <w:szCs w:val="20"/>
-            </w:rPr>
-          </w:pPr>
-          <w:r>
-            <w:rPr>
-              <w:b/>
-              <w:bCs/>
-              <w:sz w:val="20"/>
-              <w:szCs w:val="20"/>
-            </w:rPr>
-            <w:t>1.2.9 Calcul de taux de variation</w:t>
-          </w:r>
-        </w:p>
-        <w:p>
-          <w:pPr>
-            <w:rPr>
-              <w:sz w:val="20"/>
-              <w:szCs w:val="20"/>
-            </w:rPr>
-          </w:pPr>
-          <w:r>
-            <w:rPr>
-              <w:sz w:val="20"/>
-              <w:szCs w:val="20"/>
-            </w:rPr>
-            <w:t xml:space="preserve">La fonction </w:t>
+            <w:t xml:space="preserve">1.2.6 </w:t>
+          </w:r>
+          <w:r>
+            <w:rPr>
+              <w:b/>
+              <w:bCs/>
+              <w:sz w:val="20"/>
+              <w:szCs w:val="20"/>
+            </w:rPr>
+            <w:t>Indicateur de Température en Temps Réel</w:t>
+          </w:r>
+        </w:p>
+        <w:p>
+          <w:pPr>
+            <w:rPr>
+              <w:b/>
+              <w:bCs/>
+              <w:sz w:val="20"/>
+              <w:szCs w:val="20"/>
+            </w:rPr>
+          </w:pPr>
+          <w:r>
+            <w:rPr>
+              <w:b/>
+              <w:bCs/>
+              <w:noProof/>
+              <w:sz w:val="20"/>
+              <w:szCs w:val="20"/>
+            </w:rPr>
+            <w:drawing>
+              <wp:inline distT="0" distB="0" distL="0" distR="0" wp14:anchorId="28610338" wp14:editId="261E4BEF">
+                <wp:extent cx="5760720" cy="1287780"/>
+                <wp:effectExtent l="0" t="0" r="5080" b="0"/>
+                <wp:docPr id="2115461008" name="Image 1" descr="Une image contenant texte, capture d’écran, Police&#10;&#10;Le contenu généré par l’IA peut être incorrect."/>
+                <wp:cNvGraphicFramePr>
+                  <a:graphicFrameLocks xmlns:a="http://schemas.openxmlformats.org/drawingml/2006/main" noChangeAspect="1"/>
+                </wp:cNvGraphicFramePr>
+                <a:graphic xmlns:a="http://schemas.openxmlformats.org/drawingml/2006/main">
+                  <a:graphicData uri="http://schemas.openxmlformats.org/drawingml/2006/picture">
+                    <pic:pic xmlns:pic="http://schemas.openxmlformats.org/drawingml/2006/picture">
+                      <pic:nvPicPr>
+                        <pic:cNvPr id="2115461008" name="Image 1" descr="Une image contenant texte, capture d’écran, Police&#10;&#10;Le contenu généré par l’IA peut être incorrect."/>
+                        <pic:cNvPicPr/>
+                      </pic:nvPicPr>
+                      <pic:blipFill>
+                        <a:blip r:embed="rId16">
+                          <a:extLst>
+                            <a:ext uri="{28A0092B-C50C-407E-A947-70E740481C1C}">
+                              <a14:useLocalDpi xmlns:a14="http://schemas.microsoft.com/office/drawing/2010/main" val="0"/>
+                            </a:ext>
+                          </a:extLst>
+                        </a:blip>
+                        <a:stretch>
+                          <a:fillRect/>
+                        </a:stretch>
+                      </pic:blipFill>
+                      <pic:spPr>
+                        <a:xfrm>
+                          <a:off x="0" y="0"/>
+                          <a:ext cx="5760720" cy="1287780"/>
+                        </a:xfrm>
+                        <a:prstGeom prst="rect">
+                          <a:avLst/>
+                        </a:prstGeom>
+                      </pic:spPr>
+                    </pic:pic>
+                  </a:graphicData>
+                </a:graphic>
+              </wp:inline>
+            </w:drawing>
+          </w:r>
+        </w:p>
+        <w:p>
+          <w:pPr>
+            <w:jc w:val="both"/>
+            <w:rPr>
+              <w:sz w:val="20"/>
+              <w:szCs w:val="20"/>
+            </w:rPr>
+          </w:pPr>
+          <w:r>
+            <w:rPr>
+              <w:sz w:val="20"/>
+              <w:szCs w:val="20"/>
+            </w:rPr>
+            <w:t xml:space="preserve">Cette requête se distingue par sa simplicité et sa fonction spécifique de récupération de la "dernière valeur connue". Contrairement aux scripts précédents qui utilisaient </w:t>
           </w:r>
           <w:proofErr w:type="spellStart"/>
           <w:r>
@@ -7188,7 +7176,7 @@
               <w:sz w:val="20"/>
               <w:szCs w:val="20"/>
             </w:rPr>
-            <w:t>derivative</w:t>
+            <w:t>aggregateWindow</w:t>
           </w:r>
           <w:proofErr w:type="spellEnd"/>
           <w:r>
@@ -7196,8 +7184,1234 @@
               <w:sz w:val="20"/>
               <w:szCs w:val="20"/>
             </w:rPr>
-            <w:t xml:space="preserve"> permet de calculer le taux de variation entre les points de données.</w:t>
-          </w:r>
+            <w:t xml:space="preserve"> pour calculer des moyennes ou lisser des courbes sur la durée, ici la ligne 5 (|&gt; </w:t>
+          </w:r>
+          <w:proofErr w:type="gramStart"/>
+          <w:r>
+            <w:rPr>
+              <w:sz w:val="20"/>
+              <w:szCs w:val="20"/>
+            </w:rPr>
+            <w:t>last(</w:t>
+          </w:r>
+          <w:proofErr w:type="gramEnd"/>
+          <w:r>
+            <w:rPr>
+              <w:sz w:val="20"/>
+              <w:szCs w:val="20"/>
+            </w:rPr>
+            <w:t xml:space="preserve">)) demande explicitement à la base de données de ne renvoyer que le tout dernier point de données enregistré pour la température dans le </w:t>
+          </w:r>
+          <w:proofErr w:type="spellStart"/>
+          <w:r>
+            <w:rPr>
+              <w:sz w:val="20"/>
+              <w:szCs w:val="20"/>
+            </w:rPr>
+            <w:t>bucket</w:t>
+          </w:r>
+          <w:proofErr w:type="spellEnd"/>
+          <w:r>
+            <w:rPr>
+              <w:sz w:val="20"/>
+              <w:szCs w:val="20"/>
+            </w:rPr>
+            <w:t xml:space="preserve"> "</w:t>
+          </w:r>
+          <w:proofErr w:type="spellStart"/>
+          <w:r>
+            <w:rPr>
+              <w:sz w:val="20"/>
+              <w:szCs w:val="20"/>
+            </w:rPr>
+            <w:t>airsensor</w:t>
+          </w:r>
+          <w:proofErr w:type="spellEnd"/>
+          <w:r>
+            <w:rPr>
+              <w:sz w:val="20"/>
+              <w:szCs w:val="20"/>
+            </w:rPr>
+            <w:t>". Elle sert exclusivement à obtenir l'état actuel (temps réel) du système, sans se soucier de l'historique ou des tendances passées.</w:t>
+          </w:r>
+        </w:p>
+        <w:p>
+          <w:pPr>
+            <w:jc w:val="both"/>
+            <w:rPr>
+              <w:sz w:val="20"/>
+              <w:szCs w:val="20"/>
+            </w:rPr>
+          </w:pPr>
+        </w:p>
+        <w:p>
+          <w:pPr>
+            <w:jc w:val="both"/>
+            <w:rPr>
+              <w:sz w:val="20"/>
+              <w:szCs w:val="20"/>
+            </w:rPr>
+          </w:pPr>
+          <w:r>
+            <w:rPr>
+              <w:noProof/>
+              <w:sz w:val="20"/>
+              <w:szCs w:val="20"/>
+            </w:rPr>
+            <w:drawing>
+              <wp:inline distT="0" distB="0" distL="0" distR="0" wp14:anchorId="2647AE6C" wp14:editId="3241519D">
+                <wp:extent cx="5760720" cy="2167255"/>
+                <wp:effectExtent l="0" t="0" r="5080" b="4445"/>
+                <wp:docPr id="593602940" name="Image 2" descr="Une image contenant capture d’écran, horloge, Logiciel multimédia, logiciel&#10;&#10;Le contenu généré par l’IA peut être incorrect."/>
+                <wp:cNvGraphicFramePr>
+                  <a:graphicFrameLocks xmlns:a="http://schemas.openxmlformats.org/drawingml/2006/main" noChangeAspect="1"/>
+                </wp:cNvGraphicFramePr>
+                <a:graphic xmlns:a="http://schemas.openxmlformats.org/drawingml/2006/main">
+                  <a:graphicData uri="http://schemas.openxmlformats.org/drawingml/2006/picture">
+                    <pic:pic xmlns:pic="http://schemas.openxmlformats.org/drawingml/2006/picture">
+                      <pic:nvPicPr>
+                        <pic:cNvPr id="593602940" name="Image 2" descr="Une image contenant capture d’écran, horloge, Logiciel multimédia, logiciel&#10;&#10;Le contenu généré par l’IA peut être incorrect."/>
+                        <pic:cNvPicPr/>
+                      </pic:nvPicPr>
+                      <pic:blipFill>
+                        <a:blip r:embed="rId17" cstate="print">
+                          <a:extLst>
+                            <a:ext uri="{28A0092B-C50C-407E-A947-70E740481C1C}">
+                              <a14:useLocalDpi xmlns:a14="http://schemas.microsoft.com/office/drawing/2010/main" val="0"/>
+                            </a:ext>
+                          </a:extLst>
+                        </a:blip>
+                        <a:stretch>
+                          <a:fillRect/>
+                        </a:stretch>
+                      </pic:blipFill>
+                      <pic:spPr>
+                        <a:xfrm>
+                          <a:off x="0" y="0"/>
+                          <a:ext cx="5760720" cy="2167255"/>
+                        </a:xfrm>
+                        <a:prstGeom prst="rect">
+                          <a:avLst/>
+                        </a:prstGeom>
+                      </pic:spPr>
+                    </pic:pic>
+                  </a:graphicData>
+                </a:graphic>
+              </wp:inline>
+            </w:drawing>
+          </w:r>
+        </w:p>
+        <w:p>
+          <w:pPr>
+            <w:jc w:val="both"/>
+            <w:rPr>
+              <w:sz w:val="20"/>
+              <w:szCs w:val="20"/>
+            </w:rPr>
+          </w:pPr>
+          <w:r>
+            <w:rPr>
+              <w:sz w:val="20"/>
+              <w:szCs w:val="20"/>
+            </w:rPr>
+            <w:t xml:space="preserve">Le graphique, intitulé "Jauge </w:t>
+          </w:r>
+          <w:proofErr w:type="spellStart"/>
+          <w:r>
+            <w:rPr>
+              <w:sz w:val="20"/>
+              <w:szCs w:val="20"/>
+            </w:rPr>
+            <w:t>Temperature</w:t>
+          </w:r>
+          <w:proofErr w:type="spellEnd"/>
+          <w:r>
+            <w:rPr>
+              <w:sz w:val="20"/>
+              <w:szCs w:val="20"/>
+            </w:rPr>
+            <w:t>", est une visualisation de type compteur (ou gauge) conçue pour une lecture instantanée et rapide. Il affiche une valeur unique et précise de 70,90, positionnée sur une échelle semi-circulaire allant de 0 à 100. Ce type de visuel sert de tableau de bord de contrôle : il permet à l'utilisateur de vérifier en un coup d'œil si la température actuelle est dans la norme, sans avoir à analyser une courbe complexe.</w:t>
+          </w:r>
+        </w:p>
+        <w:p>
+          <w:pPr>
+            <w:rPr>
+              <w:b/>
+              <w:bCs/>
+              <w:sz w:val="20"/>
+              <w:szCs w:val="20"/>
+            </w:rPr>
+          </w:pPr>
+        </w:p>
+        <w:p>
+          <w:pPr>
+            <w:rPr>
+              <w:b/>
+              <w:bCs/>
+              <w:sz w:val="20"/>
+              <w:szCs w:val="20"/>
+            </w:rPr>
+          </w:pPr>
+        </w:p>
+        <w:p>
+          <w:pPr>
+            <w:rPr>
+              <w:b/>
+              <w:bCs/>
+              <w:sz w:val="20"/>
+              <w:szCs w:val="20"/>
+            </w:rPr>
+          </w:pPr>
+        </w:p>
+        <w:p>
+          <w:pPr>
+            <w:rPr>
+              <w:b/>
+              <w:bCs/>
+              <w:sz w:val="20"/>
+              <w:szCs w:val="20"/>
+            </w:rPr>
+          </w:pPr>
+        </w:p>
+        <w:p>
+          <w:pPr>
+            <w:rPr>
+              <w:b/>
+              <w:bCs/>
+              <w:sz w:val="20"/>
+              <w:szCs w:val="20"/>
+            </w:rPr>
+          </w:pPr>
+        </w:p>
+        <w:p>
+          <w:pPr>
+            <w:rPr>
+              <w:b/>
+              <w:bCs/>
+              <w:sz w:val="20"/>
+              <w:szCs w:val="20"/>
+            </w:rPr>
+          </w:pPr>
+        </w:p>
+        <w:p>
+          <w:pPr>
+            <w:rPr>
+              <w:b/>
+              <w:bCs/>
+              <w:sz w:val="20"/>
+              <w:szCs w:val="20"/>
+            </w:rPr>
+          </w:pPr>
+        </w:p>
+        <w:p>
+          <w:pPr>
+            <w:rPr>
+              <w:b/>
+              <w:bCs/>
+              <w:sz w:val="20"/>
+              <w:szCs w:val="20"/>
+            </w:rPr>
+          </w:pPr>
+        </w:p>
+        <w:p>
+          <w:pPr>
+            <w:rPr>
+              <w:b/>
+              <w:bCs/>
+              <w:sz w:val="20"/>
+              <w:szCs w:val="20"/>
+            </w:rPr>
+          </w:pPr>
+        </w:p>
+        <w:p>
+          <w:pPr>
+            <w:rPr>
+              <w:b/>
+              <w:bCs/>
+              <w:sz w:val="20"/>
+              <w:szCs w:val="20"/>
+            </w:rPr>
+          </w:pPr>
+          <w:r>
+            <w:rPr>
+              <w:b/>
+              <w:bCs/>
+              <w:sz w:val="20"/>
+              <w:szCs w:val="20"/>
+            </w:rPr>
+            <w:lastRenderedPageBreak/>
+            <w:t xml:space="preserve">1.2.7 </w:t>
+          </w:r>
+          <w:r>
+            <w:rPr>
+              <w:b/>
+              <w:bCs/>
+              <w:sz w:val="20"/>
+              <w:szCs w:val="20"/>
+            </w:rPr>
+            <w:t>Analyse Individuelle du Capteur TLM0100</w:t>
+          </w:r>
+        </w:p>
+        <w:p>
+          <w:pPr>
+            <w:rPr>
+              <w:b/>
+              <w:bCs/>
+              <w:sz w:val="20"/>
+              <w:szCs w:val="20"/>
+            </w:rPr>
+          </w:pPr>
+          <w:r>
+            <w:rPr>
+              <w:b/>
+              <w:bCs/>
+              <w:noProof/>
+              <w:sz w:val="20"/>
+              <w:szCs w:val="20"/>
+            </w:rPr>
+            <w:drawing>
+              <wp:inline distT="0" distB="0" distL="0" distR="0" wp14:anchorId="3B63D1EE" wp14:editId="493CBF10">
+                <wp:extent cx="5760720" cy="1445260"/>
+                <wp:effectExtent l="0" t="0" r="5080" b="2540"/>
+                <wp:docPr id="997885941" name="Image 3" descr="Une image contenant texte, capture d’écran, Police&#10;&#10;Le contenu généré par l’IA peut être incorrect."/>
+                <wp:cNvGraphicFramePr>
+                  <a:graphicFrameLocks xmlns:a="http://schemas.openxmlformats.org/drawingml/2006/main" noChangeAspect="1"/>
+                </wp:cNvGraphicFramePr>
+                <a:graphic xmlns:a="http://schemas.openxmlformats.org/drawingml/2006/main">
+                  <a:graphicData uri="http://schemas.openxmlformats.org/drawingml/2006/picture">
+                    <pic:pic xmlns:pic="http://schemas.openxmlformats.org/drawingml/2006/picture">
+                      <pic:nvPicPr>
+                        <pic:cNvPr id="997885941" name="Image 3" descr="Une image contenant texte, capture d’écran, Police&#10;&#10;Le contenu généré par l’IA peut être incorrect."/>
+                        <pic:cNvPicPr/>
+                      </pic:nvPicPr>
+                      <pic:blipFill>
+                        <a:blip r:embed="rId18">
+                          <a:extLst>
+                            <a:ext uri="{28A0092B-C50C-407E-A947-70E740481C1C}">
+                              <a14:useLocalDpi xmlns:a14="http://schemas.microsoft.com/office/drawing/2010/main" val="0"/>
+                            </a:ext>
+                          </a:extLst>
+                        </a:blip>
+                        <a:stretch>
+                          <a:fillRect/>
+                        </a:stretch>
+                      </pic:blipFill>
+                      <pic:spPr>
+                        <a:xfrm>
+                          <a:off x="0" y="0"/>
+                          <a:ext cx="5760720" cy="1445260"/>
+                        </a:xfrm>
+                        <a:prstGeom prst="rect">
+                          <a:avLst/>
+                        </a:prstGeom>
+                      </pic:spPr>
+                    </pic:pic>
+                  </a:graphicData>
+                </a:graphic>
+              </wp:inline>
+            </w:drawing>
+          </w:r>
+        </w:p>
+        <w:p>
+          <w:pPr>
+            <w:jc w:val="both"/>
+            <w:rPr>
+              <w:sz w:val="20"/>
+              <w:szCs w:val="20"/>
+            </w:rPr>
+          </w:pPr>
+          <w:r>
+            <w:rPr>
+              <w:sz w:val="20"/>
+              <w:szCs w:val="20"/>
+            </w:rPr>
+            <w:t xml:space="preserve">Cette requête se démarque par l'ajout d'un filtre de précision chirurgicale à la ligne 5 : </w:t>
+          </w:r>
+          <w:proofErr w:type="spellStart"/>
+          <w:proofErr w:type="gramStart"/>
+          <w:r>
+            <w:rPr>
+              <w:sz w:val="20"/>
+              <w:szCs w:val="20"/>
+            </w:rPr>
+            <w:t>filter</w:t>
+          </w:r>
+          <w:proofErr w:type="spellEnd"/>
+          <w:r>
+            <w:rPr>
+              <w:sz w:val="20"/>
+              <w:szCs w:val="20"/>
+            </w:rPr>
+            <w:t>(</w:t>
+          </w:r>
+          <w:proofErr w:type="spellStart"/>
+          <w:r>
+            <w:rPr>
+              <w:sz w:val="20"/>
+              <w:szCs w:val="20"/>
+            </w:rPr>
+            <w:t>fn</w:t>
+          </w:r>
+          <w:proofErr w:type="spellEnd"/>
+          <w:r>
+            <w:rPr>
+              <w:sz w:val="20"/>
+              <w:szCs w:val="20"/>
+            </w:rPr>
+            <w:t>:</w:t>
+          </w:r>
+          <w:proofErr w:type="gramEnd"/>
+          <w:r>
+            <w:rPr>
+              <w:sz w:val="20"/>
+              <w:szCs w:val="20"/>
+            </w:rPr>
+            <w:t xml:space="preserve"> (r) =&gt; r["</w:t>
+          </w:r>
+          <w:proofErr w:type="spellStart"/>
+          <w:r>
+            <w:rPr>
+              <w:sz w:val="20"/>
+              <w:szCs w:val="20"/>
+            </w:rPr>
+            <w:t>sensor_id</w:t>
+          </w:r>
+          <w:proofErr w:type="spellEnd"/>
+          <w:r>
+            <w:rPr>
+              <w:sz w:val="20"/>
+              <w:szCs w:val="20"/>
+            </w:rPr>
+            <w:t>"] == "TLM0100"). Contrairement aux requêtes précédentes qui aggloméraient les données de l'ensemble du parc de capteurs ou filtraient par valeurs (températures hautes), celle-ci isole un unique appareil physique identifié par son ID "TLM0100". Elle sert à réaliser une analyse ciblée (drill-down) pour auditer le comportement individuel d'un capteur spécifique, en ignorant le bruit ou les tendances des autres appareils environnants.</w:t>
+          </w:r>
+        </w:p>
+        <w:p>
+          <w:pPr>
+            <w:jc w:val="both"/>
+            <w:rPr>
+              <w:sz w:val="20"/>
+              <w:szCs w:val="20"/>
+            </w:rPr>
+          </w:pPr>
+        </w:p>
+        <w:p>
+          <w:pPr>
+            <w:jc w:val="both"/>
+            <w:rPr>
+              <w:sz w:val="20"/>
+              <w:szCs w:val="20"/>
+            </w:rPr>
+          </w:pPr>
+          <w:r>
+            <w:rPr>
+              <w:noProof/>
+              <w:sz w:val="20"/>
+              <w:szCs w:val="20"/>
+            </w:rPr>
+            <w:drawing>
+              <wp:inline distT="0" distB="0" distL="0" distR="0" wp14:anchorId="542C117A" wp14:editId="341C06E5">
+                <wp:extent cx="5760720" cy="2057400"/>
+                <wp:effectExtent l="0" t="0" r="5080" b="0"/>
+                <wp:docPr id="2089279893" name="Image 4" descr="Une image contenant capture d’écran, Tracé, ligne&#10;&#10;Le contenu généré par l’IA peut être incorrect."/>
+                <wp:cNvGraphicFramePr>
+                  <a:graphicFrameLocks xmlns:a="http://schemas.openxmlformats.org/drawingml/2006/main" noChangeAspect="1"/>
+                </wp:cNvGraphicFramePr>
+                <a:graphic xmlns:a="http://schemas.openxmlformats.org/drawingml/2006/main">
+                  <a:graphicData uri="http://schemas.openxmlformats.org/drawingml/2006/picture">
+                    <pic:pic xmlns:pic="http://schemas.openxmlformats.org/drawingml/2006/picture">
+                      <pic:nvPicPr>
+                        <pic:cNvPr id="2089279893" name="Image 4" descr="Une image contenant capture d’écran, Tracé, ligne&#10;&#10;Le contenu généré par l’IA peut être incorrect."/>
+                        <pic:cNvPicPr/>
+                      </pic:nvPicPr>
+                      <pic:blipFill>
+                        <a:blip r:embed="rId19" cstate="print">
+                          <a:extLst>
+                            <a:ext uri="{28A0092B-C50C-407E-A947-70E740481C1C}">
+                              <a14:useLocalDpi xmlns:a14="http://schemas.microsoft.com/office/drawing/2010/main" val="0"/>
+                            </a:ext>
+                          </a:extLst>
+                        </a:blip>
+                        <a:stretch>
+                          <a:fillRect/>
+                        </a:stretch>
+                      </pic:blipFill>
+                      <pic:spPr>
+                        <a:xfrm>
+                          <a:off x="0" y="0"/>
+                          <a:ext cx="5760720" cy="2057400"/>
+                        </a:xfrm>
+                        <a:prstGeom prst="rect">
+                          <a:avLst/>
+                        </a:prstGeom>
+                      </pic:spPr>
+                    </pic:pic>
+                  </a:graphicData>
+                </a:graphic>
+              </wp:inline>
+            </w:drawing>
+          </w:r>
+        </w:p>
+        <w:p>
+          <w:pPr>
+            <w:jc w:val="both"/>
+            <w:rPr>
+              <w:sz w:val="20"/>
+              <w:szCs w:val="20"/>
+            </w:rPr>
+          </w:pPr>
+          <w:r>
+            <w:rPr>
+              <w:sz w:val="20"/>
+              <w:szCs w:val="20"/>
+            </w:rPr>
+            <w:t>Le graphique, intitulé "</w:t>
+          </w:r>
+          <w:proofErr w:type="spellStart"/>
+          <w:r>
+            <w:rPr>
+              <w:sz w:val="20"/>
+              <w:szCs w:val="20"/>
+            </w:rPr>
+            <w:t>Temperature</w:t>
+          </w:r>
+          <w:proofErr w:type="spellEnd"/>
+          <w:r>
+            <w:rPr>
+              <w:sz w:val="20"/>
+              <w:szCs w:val="20"/>
+            </w:rPr>
+            <w:t xml:space="preserve"> de TLM0100", trace l'évolution temporelle précise de ce seul capteur sur une heure. On y observe une courbe bleue unique qui oscille finement entre 70,7 et 71,3 degrés, révélant la "signature" thermique brute de cet emplacement spécifique. L'absence de lissage excessif permet de voir les micro-variations : une baisse progressive jusqu'à environ 02h40 suivie d'une remontée, des détails qui seraient invisibles dans une moyenne globale.</w:t>
+          </w:r>
+        </w:p>
+        <w:p>
+          <w:pPr>
+            <w:rPr>
+              <w:b/>
+              <w:bCs/>
+              <w:sz w:val="20"/>
+              <w:szCs w:val="20"/>
+            </w:rPr>
+          </w:pPr>
+        </w:p>
+        <w:p>
+          <w:pPr>
+            <w:rPr>
+              <w:b/>
+              <w:bCs/>
+              <w:sz w:val="20"/>
+              <w:szCs w:val="20"/>
+            </w:rPr>
+          </w:pPr>
+        </w:p>
+        <w:p>
+          <w:pPr>
+            <w:rPr>
+              <w:b/>
+              <w:bCs/>
+              <w:sz w:val="20"/>
+              <w:szCs w:val="20"/>
+            </w:rPr>
+          </w:pPr>
+        </w:p>
+        <w:p>
+          <w:pPr>
+            <w:rPr>
+              <w:b/>
+              <w:bCs/>
+              <w:sz w:val="20"/>
+              <w:szCs w:val="20"/>
+            </w:rPr>
+          </w:pPr>
+        </w:p>
+        <w:p>
+          <w:pPr>
+            <w:rPr>
+              <w:b/>
+              <w:bCs/>
+              <w:sz w:val="20"/>
+              <w:szCs w:val="20"/>
+            </w:rPr>
+          </w:pPr>
+        </w:p>
+        <w:p>
+          <w:pPr>
+            <w:rPr>
+              <w:b/>
+              <w:bCs/>
+              <w:sz w:val="20"/>
+              <w:szCs w:val="20"/>
+            </w:rPr>
+          </w:pPr>
+        </w:p>
+        <w:p>
+          <w:pPr>
+            <w:rPr>
+              <w:b/>
+              <w:bCs/>
+              <w:sz w:val="20"/>
+              <w:szCs w:val="20"/>
+            </w:rPr>
+          </w:pPr>
+        </w:p>
+        <w:p>
+          <w:pPr>
+            <w:rPr>
+              <w:b/>
+              <w:bCs/>
+              <w:sz w:val="20"/>
+              <w:szCs w:val="20"/>
+            </w:rPr>
+          </w:pPr>
+        </w:p>
+        <w:p>
+          <w:pPr>
+            <w:rPr>
+              <w:b/>
+              <w:bCs/>
+              <w:sz w:val="20"/>
+              <w:szCs w:val="20"/>
+            </w:rPr>
+          </w:pPr>
+          <w:r>
+            <w:rPr>
+              <w:b/>
+              <w:bCs/>
+              <w:sz w:val="20"/>
+              <w:szCs w:val="20"/>
+            </w:rPr>
+            <w:lastRenderedPageBreak/>
+            <w:t xml:space="preserve">1.2.8 </w:t>
+          </w:r>
+          <w:r>
+            <w:rPr>
+              <w:b/>
+              <w:bCs/>
+              <w:sz w:val="20"/>
+              <w:szCs w:val="20"/>
+            </w:rPr>
+            <w:t>Profil Hygrométrique du Capteur TLM0100</w:t>
+          </w:r>
+        </w:p>
+        <w:p>
+          <w:pPr>
+            <w:rPr>
+              <w:b/>
+              <w:bCs/>
+              <w:sz w:val="20"/>
+              <w:szCs w:val="20"/>
+            </w:rPr>
+          </w:pPr>
+          <w:r>
+            <w:rPr>
+              <w:b/>
+              <w:bCs/>
+              <w:noProof/>
+              <w:sz w:val="20"/>
+              <w:szCs w:val="20"/>
+            </w:rPr>
+            <w:drawing>
+              <wp:inline distT="0" distB="0" distL="0" distR="0" wp14:anchorId="2C192458" wp14:editId="185C9DBC">
+                <wp:extent cx="5760720" cy="1407795"/>
+                <wp:effectExtent l="0" t="0" r="5080" b="1905"/>
+                <wp:docPr id="347771758" name="Image 5" descr="Une image contenant texte, capture d’écran, Police&#10;&#10;Le contenu généré par l’IA peut être incorrect."/>
+                <wp:cNvGraphicFramePr>
+                  <a:graphicFrameLocks xmlns:a="http://schemas.openxmlformats.org/drawingml/2006/main" noChangeAspect="1"/>
+                </wp:cNvGraphicFramePr>
+                <a:graphic xmlns:a="http://schemas.openxmlformats.org/drawingml/2006/main">
+                  <a:graphicData uri="http://schemas.openxmlformats.org/drawingml/2006/picture">
+                    <pic:pic xmlns:pic="http://schemas.openxmlformats.org/drawingml/2006/picture">
+                      <pic:nvPicPr>
+                        <pic:cNvPr id="347771758" name="Image 5" descr="Une image contenant texte, capture d’écran, Police&#10;&#10;Le contenu généré par l’IA peut être incorrect."/>
+                        <pic:cNvPicPr/>
+                      </pic:nvPicPr>
+                      <pic:blipFill>
+                        <a:blip r:embed="rId20">
+                          <a:extLst>
+                            <a:ext uri="{28A0092B-C50C-407E-A947-70E740481C1C}">
+                              <a14:useLocalDpi xmlns:a14="http://schemas.microsoft.com/office/drawing/2010/main" val="0"/>
+                            </a:ext>
+                          </a:extLst>
+                        </a:blip>
+                        <a:stretch>
+                          <a:fillRect/>
+                        </a:stretch>
+                      </pic:blipFill>
+                      <pic:spPr>
+                        <a:xfrm>
+                          <a:off x="0" y="0"/>
+                          <a:ext cx="5760720" cy="1407795"/>
+                        </a:xfrm>
+                        <a:prstGeom prst="rect">
+                          <a:avLst/>
+                        </a:prstGeom>
+                      </pic:spPr>
+                    </pic:pic>
+                  </a:graphicData>
+                </a:graphic>
+              </wp:inline>
+            </w:drawing>
+          </w:r>
+        </w:p>
+        <w:p>
+          <w:pPr>
+            <w:jc w:val="both"/>
+            <w:rPr>
+              <w:sz w:val="20"/>
+              <w:szCs w:val="20"/>
+            </w:rPr>
+          </w:pPr>
+          <w:r>
+            <w:rPr>
+              <w:sz w:val="20"/>
+              <w:szCs w:val="20"/>
+            </w:rPr>
+            <w:t xml:space="preserve">Cette requête est la jumelle de la précédente, conçue pour compléter le diagnostic du capteur "TLM0100". Si la cible reste le même appareil unique (identifié à la ligne 5), le changement crucial se situe à la ligne 4 : </w:t>
+          </w:r>
+          <w:proofErr w:type="spellStart"/>
+          <w:proofErr w:type="gramStart"/>
+          <w:r>
+            <w:rPr>
+              <w:sz w:val="20"/>
+              <w:szCs w:val="20"/>
+            </w:rPr>
+            <w:t>filter</w:t>
+          </w:r>
+          <w:proofErr w:type="spellEnd"/>
+          <w:r>
+            <w:rPr>
+              <w:sz w:val="20"/>
+              <w:szCs w:val="20"/>
+            </w:rPr>
+            <w:t>(</w:t>
+          </w:r>
+          <w:proofErr w:type="spellStart"/>
+          <w:r>
+            <w:rPr>
+              <w:sz w:val="20"/>
+              <w:szCs w:val="20"/>
+            </w:rPr>
+            <w:t>fn</w:t>
+          </w:r>
+          <w:proofErr w:type="spellEnd"/>
+          <w:r>
+            <w:rPr>
+              <w:sz w:val="20"/>
+              <w:szCs w:val="20"/>
+            </w:rPr>
+            <w:t>:</w:t>
+          </w:r>
+          <w:proofErr w:type="gramEnd"/>
+          <w:r>
+            <w:rPr>
+              <w:sz w:val="20"/>
+              <w:szCs w:val="20"/>
+            </w:rPr>
+            <w:t xml:space="preserve"> (r) =&gt; r["_</w:t>
+          </w:r>
+          <w:proofErr w:type="spellStart"/>
+          <w:r>
+            <w:rPr>
+              <w:sz w:val="20"/>
+              <w:szCs w:val="20"/>
+            </w:rPr>
+            <w:t>field</w:t>
+          </w:r>
+          <w:proofErr w:type="spellEnd"/>
+          <w:r>
+            <w:rPr>
+              <w:sz w:val="20"/>
+              <w:szCs w:val="20"/>
+            </w:rPr>
+            <w:t>"] == "</w:t>
+          </w:r>
+          <w:proofErr w:type="spellStart"/>
+          <w:r>
+            <w:rPr>
+              <w:sz w:val="20"/>
+              <w:szCs w:val="20"/>
+            </w:rPr>
+            <w:t>humidity</w:t>
+          </w:r>
+          <w:proofErr w:type="spellEnd"/>
+          <w:r>
+            <w:rPr>
+              <w:sz w:val="20"/>
+              <w:szCs w:val="20"/>
+            </w:rPr>
+            <w:t>"). Elle sert à extraire spécifiquement les mesures d'humidité brute pour ce seul emplacement, permettant de vérifier si les variations de l'air suivent les mêmes tendances que la température observée auparavant.</w:t>
+          </w:r>
+        </w:p>
+        <w:p>
+          <w:pPr>
+            <w:jc w:val="both"/>
+            <w:rPr>
+              <w:sz w:val="20"/>
+              <w:szCs w:val="20"/>
+            </w:rPr>
+          </w:pPr>
+        </w:p>
+        <w:p>
+          <w:pPr>
+            <w:jc w:val="both"/>
+            <w:rPr>
+              <w:sz w:val="20"/>
+              <w:szCs w:val="20"/>
+            </w:rPr>
+          </w:pPr>
+          <w:r>
+            <w:rPr>
+              <w:noProof/>
+              <w:sz w:val="20"/>
+              <w:szCs w:val="20"/>
+            </w:rPr>
+            <w:drawing>
+              <wp:inline distT="0" distB="0" distL="0" distR="0" wp14:anchorId="0947DA69" wp14:editId="3655C90E">
+                <wp:extent cx="5760720" cy="2411095"/>
+                <wp:effectExtent l="0" t="0" r="5080" b="1905"/>
+                <wp:docPr id="1491418217" name="Image 6" descr="Une image contenant capture d’écran&#10;&#10;Le contenu généré par l’IA peut être incorrect."/>
+                <wp:cNvGraphicFramePr>
+                  <a:graphicFrameLocks xmlns:a="http://schemas.openxmlformats.org/drawingml/2006/main" noChangeAspect="1"/>
+                </wp:cNvGraphicFramePr>
+                <a:graphic xmlns:a="http://schemas.openxmlformats.org/drawingml/2006/main">
+                  <a:graphicData uri="http://schemas.openxmlformats.org/drawingml/2006/picture">
+                    <pic:pic xmlns:pic="http://schemas.openxmlformats.org/drawingml/2006/picture">
+                      <pic:nvPicPr>
+                        <pic:cNvPr id="1491418217" name="Image 6" descr="Une image contenant capture d’écran&#10;&#10;Le contenu généré par l’IA peut être incorrect."/>
+                        <pic:cNvPicPr/>
+                      </pic:nvPicPr>
+                      <pic:blipFill>
+                        <a:blip r:embed="rId21" cstate="print">
+                          <a:extLst>
+                            <a:ext uri="{28A0092B-C50C-407E-A947-70E740481C1C}">
+                              <a14:useLocalDpi xmlns:a14="http://schemas.microsoft.com/office/drawing/2010/main" val="0"/>
+                            </a:ext>
+                          </a:extLst>
+                        </a:blip>
+                        <a:stretch>
+                          <a:fillRect/>
+                        </a:stretch>
+                      </pic:blipFill>
+                      <pic:spPr>
+                        <a:xfrm>
+                          <a:off x="0" y="0"/>
+                          <a:ext cx="5760720" cy="2411095"/>
+                        </a:xfrm>
+                        <a:prstGeom prst="rect">
+                          <a:avLst/>
+                        </a:prstGeom>
+                      </pic:spPr>
+                    </pic:pic>
+                  </a:graphicData>
+                </a:graphic>
+              </wp:inline>
+            </w:drawing>
+          </w:r>
+        </w:p>
+        <w:p>
+          <w:pPr>
+            <w:jc w:val="both"/>
+            <w:rPr>
+              <w:sz w:val="20"/>
+              <w:szCs w:val="20"/>
+            </w:rPr>
+          </w:pPr>
+          <w:r>
+            <w:rPr>
+              <w:sz w:val="20"/>
+              <w:szCs w:val="20"/>
+            </w:rPr>
+            <w:t>Le graphique, intitulé "Humidité de TLM0100", révèle un comportement beaucoup plus instable que celui de la température. La courbe bleue montre une forte volatilité : elle monte rapidement pour atteindre un pic maximal vers 35,45 autour de 02h10, avant d'entamer une descente irrégulière et hachée pour finir à son niveau le plus bas (environ 34,85) à la fin de l'heure. Cela indique que l'humidité locale varie constamment, contrairement à la température qui semblait suivre une tendance plus lisse.</w:t>
+          </w:r>
+        </w:p>
+        <w:p>
+          <w:pPr>
+            <w:rPr>
+              <w:b/>
+              <w:bCs/>
+              <w:sz w:val="20"/>
+              <w:szCs w:val="20"/>
+            </w:rPr>
+          </w:pPr>
+        </w:p>
+        <w:p>
+          <w:pPr>
+            <w:rPr>
+              <w:b/>
+              <w:bCs/>
+              <w:sz w:val="20"/>
+              <w:szCs w:val="20"/>
+            </w:rPr>
+          </w:pPr>
+        </w:p>
+        <w:p>
+          <w:pPr>
+            <w:rPr>
+              <w:b/>
+              <w:bCs/>
+              <w:sz w:val="20"/>
+              <w:szCs w:val="20"/>
+            </w:rPr>
+          </w:pPr>
+        </w:p>
+        <w:p>
+          <w:pPr>
+            <w:rPr>
+              <w:b/>
+              <w:bCs/>
+              <w:sz w:val="20"/>
+              <w:szCs w:val="20"/>
+            </w:rPr>
+          </w:pPr>
+        </w:p>
+        <w:p>
+          <w:pPr>
+            <w:rPr>
+              <w:b/>
+              <w:bCs/>
+              <w:sz w:val="20"/>
+              <w:szCs w:val="20"/>
+            </w:rPr>
+          </w:pPr>
+        </w:p>
+        <w:p>
+          <w:pPr>
+            <w:rPr>
+              <w:b/>
+              <w:bCs/>
+              <w:sz w:val="20"/>
+              <w:szCs w:val="20"/>
+            </w:rPr>
+          </w:pPr>
+        </w:p>
+        <w:p>
+          <w:pPr>
+            <w:rPr>
+              <w:b/>
+              <w:bCs/>
+              <w:sz w:val="20"/>
+              <w:szCs w:val="20"/>
+            </w:rPr>
+          </w:pPr>
+        </w:p>
+        <w:p>
+          <w:pPr>
+            <w:rPr>
+              <w:b/>
+              <w:bCs/>
+              <w:sz w:val="20"/>
+              <w:szCs w:val="20"/>
+            </w:rPr>
+          </w:pPr>
+        </w:p>
+        <w:p>
+          <w:pPr>
+            <w:rPr>
+              <w:b/>
+              <w:bCs/>
+              <w:sz w:val="20"/>
+              <w:szCs w:val="20"/>
+            </w:rPr>
+          </w:pPr>
+          <w:r>
+            <w:rPr>
+              <w:b/>
+              <w:bCs/>
+              <w:sz w:val="20"/>
+              <w:szCs w:val="20"/>
+            </w:rPr>
+            <w:lastRenderedPageBreak/>
+            <w:t xml:space="preserve">1.2.9 </w:t>
+          </w:r>
+          <w:r>
+            <w:rPr>
+              <w:b/>
+              <w:bCs/>
+              <w:sz w:val="20"/>
+              <w:szCs w:val="20"/>
+            </w:rPr>
+            <w:t>Dynamique du CO2 pour le Capteur TLM0100</w:t>
+          </w:r>
+        </w:p>
+        <w:p>
+          <w:pPr>
+            <w:rPr>
+              <w:b/>
+              <w:bCs/>
+              <w:sz w:val="20"/>
+              <w:szCs w:val="20"/>
+            </w:rPr>
+          </w:pPr>
+          <w:r>
+            <w:rPr>
+              <w:b/>
+              <w:bCs/>
+              <w:noProof/>
+              <w:sz w:val="20"/>
+              <w:szCs w:val="20"/>
+            </w:rPr>
+            <w:drawing>
+              <wp:inline distT="0" distB="0" distL="0" distR="0" wp14:anchorId="72A6F60E" wp14:editId="7AB94397">
+                <wp:extent cx="5760720" cy="1296670"/>
+                <wp:effectExtent l="0" t="0" r="5080" b="0"/>
+                <wp:docPr id="2113035957" name="Image 7" descr="Une image contenant texte, capture d’écran, Police&#10;&#10;Le contenu généré par l’IA peut être incorrect."/>
+                <wp:cNvGraphicFramePr>
+                  <a:graphicFrameLocks xmlns:a="http://schemas.openxmlformats.org/drawingml/2006/main" noChangeAspect="1"/>
+                </wp:cNvGraphicFramePr>
+                <a:graphic xmlns:a="http://schemas.openxmlformats.org/drawingml/2006/main">
+                  <a:graphicData uri="http://schemas.openxmlformats.org/drawingml/2006/picture">
+                    <pic:pic xmlns:pic="http://schemas.openxmlformats.org/drawingml/2006/picture">
+                      <pic:nvPicPr>
+                        <pic:cNvPr id="2113035957" name="Image 7" descr="Une image contenant texte, capture d’écran, Police&#10;&#10;Le contenu généré par l’IA peut être incorrect."/>
+                        <pic:cNvPicPr/>
+                      </pic:nvPicPr>
+                      <pic:blipFill>
+                        <a:blip r:embed="rId22">
+                          <a:extLst>
+                            <a:ext uri="{28A0092B-C50C-407E-A947-70E740481C1C}">
+                              <a14:useLocalDpi xmlns:a14="http://schemas.microsoft.com/office/drawing/2010/main" val="0"/>
+                            </a:ext>
+                          </a:extLst>
+                        </a:blip>
+                        <a:stretch>
+                          <a:fillRect/>
+                        </a:stretch>
+                      </pic:blipFill>
+                      <pic:spPr>
+                        <a:xfrm>
+                          <a:off x="0" y="0"/>
+                          <a:ext cx="5760720" cy="1296670"/>
+                        </a:xfrm>
+                        <a:prstGeom prst="rect">
+                          <a:avLst/>
+                        </a:prstGeom>
+                      </pic:spPr>
+                    </pic:pic>
+                  </a:graphicData>
+                </a:graphic>
+              </wp:inline>
+            </w:drawing>
+          </w:r>
+        </w:p>
+        <w:p>
+          <w:pPr>
+            <w:jc w:val="both"/>
+            <w:rPr>
+              <w:sz w:val="20"/>
+              <w:szCs w:val="20"/>
+            </w:rPr>
+          </w:pPr>
+          <w:r>
+            <w:rPr>
+              <w:sz w:val="20"/>
+              <w:szCs w:val="20"/>
+            </w:rPr>
+            <w:t xml:space="preserve">Cette requête complète le profil du capteur "TLM0100" en interrogeant une troisième métrique environnementale. Si la structure reste identique pour le ciblage de l'appareil (ligne 5), la modification clé se trouve à la ligne 4 : </w:t>
+          </w:r>
+          <w:proofErr w:type="spellStart"/>
+          <w:proofErr w:type="gramStart"/>
+          <w:r>
+            <w:rPr>
+              <w:sz w:val="20"/>
+              <w:szCs w:val="20"/>
+            </w:rPr>
+            <w:t>filter</w:t>
+          </w:r>
+          <w:proofErr w:type="spellEnd"/>
+          <w:r>
+            <w:rPr>
+              <w:sz w:val="20"/>
+              <w:szCs w:val="20"/>
+            </w:rPr>
+            <w:t>(</w:t>
+          </w:r>
+          <w:proofErr w:type="spellStart"/>
+          <w:r>
+            <w:rPr>
+              <w:sz w:val="20"/>
+              <w:szCs w:val="20"/>
+            </w:rPr>
+            <w:t>fn</w:t>
+          </w:r>
+          <w:proofErr w:type="spellEnd"/>
+          <w:r>
+            <w:rPr>
+              <w:sz w:val="20"/>
+              <w:szCs w:val="20"/>
+            </w:rPr>
+            <w:t>:</w:t>
+          </w:r>
+          <w:proofErr w:type="gramEnd"/>
+          <w:r>
+            <w:rPr>
+              <w:sz w:val="20"/>
+              <w:szCs w:val="20"/>
+            </w:rPr>
+            <w:t xml:space="preserve"> (r) =&gt; r["_</w:t>
+          </w:r>
+          <w:proofErr w:type="spellStart"/>
+          <w:r>
+            <w:rPr>
+              <w:sz w:val="20"/>
+              <w:szCs w:val="20"/>
+            </w:rPr>
+            <w:t>field</w:t>
+          </w:r>
+          <w:proofErr w:type="spellEnd"/>
+          <w:r>
+            <w:rPr>
+              <w:sz w:val="20"/>
+              <w:szCs w:val="20"/>
+            </w:rPr>
+            <w:t>"] == "</w:t>
+          </w:r>
+          <w:proofErr w:type="spellStart"/>
+          <w:r>
+            <w:rPr>
+              <w:sz w:val="20"/>
+              <w:szCs w:val="20"/>
+            </w:rPr>
+            <w:t>co</w:t>
+          </w:r>
+          <w:proofErr w:type="spellEnd"/>
+          <w:r>
+            <w:rPr>
+              <w:sz w:val="20"/>
+              <w:szCs w:val="20"/>
+            </w:rPr>
+            <w:t>"). Elle sert à extraire spécifiquement les mesures de gaz (ici identifiées comme "</w:t>
+          </w:r>
+          <w:proofErr w:type="spellStart"/>
+          <w:r>
+            <w:rPr>
+              <w:sz w:val="20"/>
+              <w:szCs w:val="20"/>
+            </w:rPr>
+            <w:t>co</w:t>
+          </w:r>
+          <w:proofErr w:type="spellEnd"/>
+          <w:r>
+            <w:rPr>
+              <w:sz w:val="20"/>
+              <w:szCs w:val="20"/>
+            </w:rPr>
+            <w:t>", probablement pour le CO2 selon le titre du graphe) pour ce capteur unique, permettant de vérifier la qualité de l'air locale indépendamment des autres zones.</w:t>
+          </w:r>
+        </w:p>
+        <w:p>
+          <w:pPr>
+            <w:rPr>
+              <w:b/>
+              <w:bCs/>
+              <w:sz w:val="20"/>
+              <w:szCs w:val="20"/>
+            </w:rPr>
+          </w:pPr>
+        </w:p>
+        <w:p>
+          <w:pPr>
+            <w:rPr>
+              <w:b/>
+              <w:bCs/>
+              <w:sz w:val="20"/>
+              <w:szCs w:val="20"/>
+            </w:rPr>
+          </w:pPr>
+          <w:r>
+            <w:rPr>
+              <w:b/>
+              <w:bCs/>
+              <w:noProof/>
+              <w:sz w:val="20"/>
+              <w:szCs w:val="20"/>
+            </w:rPr>
+            <w:drawing>
+              <wp:inline distT="0" distB="0" distL="0" distR="0" wp14:anchorId="53083543" wp14:editId="7633A535">
+                <wp:extent cx="5760720" cy="2543810"/>
+                <wp:effectExtent l="0" t="0" r="5080" b="0"/>
+                <wp:docPr id="1701315139" name="Image 8" descr="Une image contenant capture d’écran, Tracé&#10;&#10;Le contenu généré par l’IA peut être incorrect."/>
+                <wp:cNvGraphicFramePr>
+                  <a:graphicFrameLocks xmlns:a="http://schemas.openxmlformats.org/drawingml/2006/main" noChangeAspect="1"/>
+                </wp:cNvGraphicFramePr>
+                <a:graphic xmlns:a="http://schemas.openxmlformats.org/drawingml/2006/main">
+                  <a:graphicData uri="http://schemas.openxmlformats.org/drawingml/2006/picture">
+                    <pic:pic xmlns:pic="http://schemas.openxmlformats.org/drawingml/2006/picture">
+                      <pic:nvPicPr>
+                        <pic:cNvPr id="1701315139" name="Image 8" descr="Une image contenant capture d’écran, Tracé&#10;&#10;Le contenu généré par l’IA peut être incorrect."/>
+                        <pic:cNvPicPr/>
+                      </pic:nvPicPr>
+                      <pic:blipFill>
+                        <a:blip r:embed="rId23" cstate="print">
+                          <a:extLst>
+                            <a:ext uri="{28A0092B-C50C-407E-A947-70E740481C1C}">
+                              <a14:useLocalDpi xmlns:a14="http://schemas.microsoft.com/office/drawing/2010/main" val="0"/>
+                            </a:ext>
+                          </a:extLst>
+                        </a:blip>
+                        <a:stretch>
+                          <a:fillRect/>
+                        </a:stretch>
+                      </pic:blipFill>
+                      <pic:spPr>
+                        <a:xfrm>
+                          <a:off x="0" y="0"/>
+                          <a:ext cx="5760720" cy="2543810"/>
+                        </a:xfrm>
+                        <a:prstGeom prst="rect">
+                          <a:avLst/>
+                        </a:prstGeom>
+                      </pic:spPr>
+                    </pic:pic>
+                  </a:graphicData>
+                </a:graphic>
+              </wp:inline>
+            </w:drawing>
+          </w:r>
+        </w:p>
+        <w:p>
+          <w:pPr>
+            <w:jc w:val="both"/>
+            <w:rPr>
+              <w:sz w:val="20"/>
+              <w:szCs w:val="20"/>
+            </w:rPr>
+          </w:pPr>
+          <w:r>
+            <w:rPr>
+              <w:sz w:val="20"/>
+              <w:szCs w:val="20"/>
+            </w:rPr>
+            <w:t>Le graphique, intitulé "CO2 de TLM0100", montre une évolution très dynamique et volatile, bien loin de la stabilité thermique observée plus tôt. La courbe suit une tendance en "montagne russe" : elle oscille d'abord autour de 500m (0,5 unité), grimpe pour atteindre un sommet marqué vers 640m (0,64) aux alentours de 02h35, avant de chuter brutalement pour finir à son niveau le plus bas, sous la barre des 400m (0,4). Ce profil suggère un événement passager (comme le passage d'une personne) qui a temporairement fait monter le niveau avant un retour à la normale.</w:t>
+          </w:r>
+        </w:p>
+        <w:p>
+          <w:pPr>
+            <w:rPr>
+              <w:b/>
+              <w:bCs/>
+              <w:sz w:val="20"/>
+              <w:szCs w:val="20"/>
+            </w:rPr>
+          </w:pPr>
+        </w:p>
+        <w:p>
+          <w:pPr>
+            <w:rPr>
+              <w:b/>
+              <w:bCs/>
+              <w:sz w:val="20"/>
+              <w:szCs w:val="20"/>
+            </w:rPr>
+          </w:pPr>
+        </w:p>
+        <w:p>
+          <w:pPr>
+            <w:rPr>
+              <w:b/>
+              <w:bCs/>
+              <w:sz w:val="20"/>
+              <w:szCs w:val="20"/>
+            </w:rPr>
+          </w:pPr>
         </w:p>
         <w:p>
           <w:pPr>
@@ -7259,6 +8473,7 @@
           </w:pPr>
           <w:bookmarkStart w:id="19" w:name="_Toc219278385"/>
           <w:r>
+            <w:lastRenderedPageBreak/>
             <w:t>Requêtes adaptées aux différents types de visualisations</w:t>
           </w:r>
           <w:bookmarkEnd w:id="19"/>
@@ -8111,6 +9326,7 @@
               <w:sz w:val="20"/>
               <w:szCs w:val="20"/>
             </w:rPr>
+            <w:lastRenderedPageBreak/>
             <w:t xml:space="preserve">Les bonnes pratiques identifiées, notamment concernant la minimisation de la cardinalité des tags et l'optimisation des requêtes, sont applicables à tout projet utilisant </w:t>
           </w:r>
           <w:proofErr w:type="spellStart"/>
@@ -13288,6 +14504,7 @@
     <w:rsid w:val="007476F9"/>
     <w:rsid w:val="009A6620"/>
     <w:rsid w:val="00A81EE0"/>
+    <w:rsid w:val="00B71213"/>
     <w:rsid w:val="00BF6AD5"/>
     <w:rsid w:val="00D0243A"/>
     <w:rsid w:val="00D41ABF"/>

</xml_diff>